<commit_message>
docs: sematkan 8 diagram PNG ke Blueprint & perdetail konfigurasi sistem
- Blueprint kini dokumen utuh: 8 diagram arsitektur/alur tersemat (Bagian 1, 3, 7).
- Bagian 5 Konfigurasi diperluas jadi 12 subseksi tingkat-field:
  perusahaan/akuntansi, pemetaan akun→Report Category, properti/owners/analytic,
  trust accounting, security deposit, produk layanan, GTO/meter, CAM,
  fixed asset, CORETAX, cron+interval, sequence/portal/email/multi-entitas.

Co-Authored-By: Claude Opus 4.8 <noreply@anthropic.com>
Claude-Session: https://claude.ai/code/session_016VgZWku95cicE6VZPkFTLL
</commit_message>
<xml_diff>
--- a/docs/Blueprint_Installation_Configuration.docx
+++ b/docs/Blueprint_Installation_Configuration.docx
@@ -559,6 +559,177 @@
       </w:tr>
     </w:tbl>
     <w:p/>
+    <w:p>
+      <w:pPr>
+        <w:pStyle w:val="Heading2"/>
+      </w:pPr>
+      <w:r>
+        <w:rPr>
+          <w:color w:val="006A4E"/>
+          <w:sz w:val="25"/>
+        </w:rPr>
+        <w:t>1.3 Diagram Arsitektur</w:t>
+      </w:r>
+    </w:p>
+    <w:p>
+      <w:pPr>
+        <w:jc w:val="center"/>
+      </w:pPr>
+      <w:r>
+        <w:drawing>
+          <wp:inline xmlns:a="http://schemas.openxmlformats.org/drawingml/2006/main" xmlns:pic="http://schemas.openxmlformats.org/drawingml/2006/picture">
+            <wp:extent cx="6035040" cy="1331712"/>
+            <wp:docPr id="1" name="Picture 1"/>
+            <wp:cNvGraphicFramePr>
+              <a:graphicFrameLocks noChangeAspect="1"/>
+            </wp:cNvGraphicFramePr>
+            <a:graphic>
+              <a:graphicData uri="http://schemas.openxmlformats.org/drawingml/2006/picture">
+                <pic:pic>
+                  <pic:nvPicPr>
+                    <pic:cNvPr id="0" name="01-arsitektur-sistem.png"/>
+                    <pic:cNvPicPr/>
+                  </pic:nvPicPr>
+                  <pic:blipFill>
+                    <a:blip r:embed="rId9"/>
+                    <a:stretch>
+                      <a:fillRect/>
+                    </a:stretch>
+                  </pic:blipFill>
+                  <pic:spPr>
+                    <a:xfrm>
+                      <a:off x="0" y="0"/>
+                      <a:ext cx="6035040" cy="1331712"/>
+                    </a:xfrm>
+                    <a:prstGeom prst="rect"/>
+                  </pic:spPr>
+                </pic:pic>
+              </a:graphicData>
+            </a:graphic>
+          </wp:inline>
+        </w:drawing>
+      </w:r>
+    </w:p>
+    <w:p>
+      <w:pPr>
+        <w:spacing w:after="200"/>
+        <w:jc w:val="center"/>
+      </w:pPr>
+      <w:r>
+        <w:rPr>
+          <w:i/>
+          <w:color w:val="555555"/>
+          <w:sz w:val="17"/>
+        </w:rPr>
+        <w:t>Gambar 1. Arsitektur sistem berlapis: Lapisan Akses → 26 modul companion → addon rental_management → modul standar Odoo 19.</w:t>
+      </w:r>
+    </w:p>
+    <w:p>
+      <w:pPr>
+        <w:jc w:val="center"/>
+      </w:pPr>
+      <w:r>
+        <w:drawing>
+          <wp:inline xmlns:a="http://schemas.openxmlformats.org/drawingml/2006/main" xmlns:pic="http://schemas.openxmlformats.org/drawingml/2006/picture">
+            <wp:extent cx="6035040" cy="1416387"/>
+            <wp:docPr id="2" name="Picture 2"/>
+            <wp:cNvGraphicFramePr>
+              <a:graphicFrameLocks noChangeAspect="1"/>
+            </wp:cNvGraphicFramePr>
+            <a:graphic>
+              <a:graphicData uri="http://schemas.openxmlformats.org/drawingml/2006/picture">
+                <pic:pic>
+                  <pic:nvPicPr>
+                    <pic:cNvPr id="0" name="02-arsitektur-data.png"/>
+                    <pic:cNvPicPr/>
+                  </pic:nvPicPr>
+                  <pic:blipFill>
+                    <a:blip r:embed="rId10"/>
+                    <a:stretch>
+                      <a:fillRect/>
+                    </a:stretch>
+                  </pic:blipFill>
+                  <pic:spPr>
+                    <a:xfrm>
+                      <a:off x="0" y="0"/>
+                      <a:ext cx="6035040" cy="1416387"/>
+                    </a:xfrm>
+                    <a:prstGeom prst="rect"/>
+                  </pic:spPr>
+                </pic:pic>
+              </a:graphicData>
+            </a:graphic>
+          </wp:inline>
+        </w:drawing>
+      </w:r>
+    </w:p>
+    <w:p>
+      <w:pPr>
+        <w:spacing w:after="200"/>
+        <w:jc w:val="center"/>
+      </w:pPr>
+      <w:r>
+        <w:rPr>
+          <w:i/>
+          <w:color w:val="555555"/>
+          <w:sz w:val="17"/>
+        </w:rPr>
+        <w:t>Gambar 2. Arsitektur data — rantai atribusi properti hingga analytic &amp; Owners Statement.</w:t>
+      </w:r>
+    </w:p>
+    <w:p>
+      <w:pPr>
+        <w:jc w:val="center"/>
+      </w:pPr>
+      <w:r>
+        <w:drawing>
+          <wp:inline xmlns:a="http://schemas.openxmlformats.org/drawingml/2006/main" xmlns:pic="http://schemas.openxmlformats.org/drawingml/2006/picture">
+            <wp:extent cx="6035040" cy="15175064"/>
+            <wp:docPr id="3" name="Picture 3"/>
+            <wp:cNvGraphicFramePr>
+              <a:graphicFrameLocks noChangeAspect="1"/>
+            </wp:cNvGraphicFramePr>
+            <a:graphic>
+              <a:graphicData uri="http://schemas.openxmlformats.org/drawingml/2006/picture">
+                <pic:pic>
+                  <pic:nvPicPr>
+                    <pic:cNvPr id="0" name="08-analytic-crosscutting.png"/>
+                    <pic:cNvPicPr/>
+                  </pic:nvPicPr>
+                  <pic:blipFill>
+                    <a:blip r:embed="rId11"/>
+                    <a:stretch>
+                      <a:fillRect/>
+                    </a:stretch>
+                  </pic:blipFill>
+                  <pic:spPr>
+                    <a:xfrm>
+                      <a:off x="0" y="0"/>
+                      <a:ext cx="6035040" cy="15175064"/>
+                    </a:xfrm>
+                    <a:prstGeom prst="rect"/>
+                  </pic:spPr>
+                </pic:pic>
+              </a:graphicData>
+            </a:graphic>
+          </wp:inline>
+        </w:drawing>
+      </w:r>
+    </w:p>
+    <w:p>
+      <w:pPr>
+        <w:spacing w:after="200"/>
+        <w:jc w:val="center"/>
+      </w:pPr>
+      <w:r>
+        <w:rPr>
+          <w:i/>
+          <w:color w:val="555555"/>
+          <w:sz w:val="17"/>
+        </w:rPr>
+        <w:t>Gambar 3. Integrasi cross-cutting: override account.move._post mencap analytic seluruh dokumen.</w:t>
+      </w:r>
+    </w:p>
     <w:p>
       <w:r>
         <w:br w:type="page"/>
@@ -2772,6 +2943,59 @@
       </w:r>
     </w:p>
     <w:p>
+      <w:pPr>
+        <w:jc w:val="center"/>
+      </w:pPr>
+      <w:r>
+        <w:drawing>
+          <wp:inline xmlns:a="http://schemas.openxmlformats.org/drawingml/2006/main" xmlns:pic="http://schemas.openxmlformats.org/drawingml/2006/picture">
+            <wp:extent cx="6035040" cy="19877406"/>
+            <wp:docPr id="4" name="Picture 4"/>
+            <wp:cNvGraphicFramePr>
+              <a:graphicFrameLocks noChangeAspect="1"/>
+            </wp:cNvGraphicFramePr>
+            <a:graphic>
+              <a:graphicData uri="http://schemas.openxmlformats.org/drawingml/2006/picture">
+                <pic:pic>
+                  <pic:nvPicPr>
+                    <pic:cNvPr id="0" name="03-siklus-hidup-tenant.png"/>
+                    <pic:cNvPicPr/>
+                  </pic:nvPicPr>
+                  <pic:blipFill>
+                    <a:blip r:embed="rId12"/>
+                    <a:stretch>
+                      <a:fillRect/>
+                    </a:stretch>
+                  </pic:blipFill>
+                  <pic:spPr>
+                    <a:xfrm>
+                      <a:off x="0" y="0"/>
+                      <a:ext cx="6035040" cy="19877406"/>
+                    </a:xfrm>
+                    <a:prstGeom prst="rect"/>
+                  </pic:spPr>
+                </pic:pic>
+              </a:graphicData>
+            </a:graphic>
+          </wp:inline>
+        </w:drawing>
+      </w:r>
+    </w:p>
+    <w:p>
+      <w:pPr>
+        <w:spacing w:after="200"/>
+        <w:jc w:val="center"/>
+      </w:pPr>
+      <w:r>
+        <w:rPr>
+          <w:i/>
+          <w:color w:val="555555"/>
+          <w:sz w:val="17"/>
+        </w:rPr>
+        <w:t>Gambar 4. Siklus hidup tenant end-to-end (lead → aktivasi → billing → move-out).</w:t>
+      </w:r>
+    </w:p>
+    <w:p>
       <w:r>
         <w:br w:type="page"/>
       </w:r>
@@ -3382,7 +3606,21 @@
           <w:color w:val="1F3964"/>
           <w:sz w:val="30"/>
         </w:rPr>
-        <w:t>5. Konfigurasi Sistem</w:t>
+        <w:t>5. Konfigurasi Sistem (Detail)</w:t>
+      </w:r>
+    </w:p>
+    <w:p>
+      <w:pPr>
+        <w:spacing w:after="120"/>
+      </w:pPr>
+      <w:r>
+        <w:rPr>
+          <w:b w:val="0"/>
+          <w:i/>
+          <w:color w:val="555555"/>
+          <w:sz w:val="21"/>
+        </w:rPr>
+        <w:t>Bagian ini menjabarkan konfigurasi tingkat-field per area. Ikuti urutan 5.1 → 5.12. Tanda (Wajib) menunjukkan setting yang harus diisi agar laporan/otomasi berfungsi; (Opsional) dapat dilewati bila modul terkait tidak dipakai.</w:t>
       </w:r>
     </w:p>
     <w:p>
@@ -3394,7 +3632,7 @@
           <w:color w:val="006A4E"/>
           <w:sz w:val="25"/>
         </w:rPr>
-        <w:t>5.1 Akuntansi &amp; Properti (wajib agar laporan terisi)</w:t>
+        <w:t>5.1 Perusahaan &amp; Akuntansi Dasar (Wajib)</w:t>
       </w:r>
     </w:p>
     <w:p>
@@ -3402,7 +3640,7 @@
         <w:pStyle w:val="ListNumber"/>
       </w:pPr>
       <w:r>
-        <w:t>Accounting → Chart of Accounts: set field "Property Report Category" pada akun income/expense (atau via Properties → CORETAX/Financial → Report Categories).</w:t>
+        <w:t>Settings → Companies: lengkapi data perusahaan (nama legal, NPWP, alamat, mata uang fungsional).</w:t>
       </w:r>
     </w:p>
     <w:p>
@@ -3410,7 +3648,7 @@
         <w:pStyle w:val="ListNumber"/>
       </w:pPr>
       <w:r>
-        <w:t>Per properti (tab Owners &amp; Financial): isi Owners + ownership %, Property Manager, dan klik "Create Analytic Account".</w:t>
+        <w:t>Accounting → Configuration → Settings: aktifkan "Analytic Accounting" dan (bila perlu) "Multi-Currencies" serta "Multi-Companies".</w:t>
       </w:r>
     </w:p>
     <w:p>
@@ -3418,7 +3656,7 @@
         <w:pStyle w:val="ListNumber"/>
       </w:pPr>
       <w:r>
-        <w:t>Trust Accounting (per properti): set Trust Bank Account, Owners Remittance Account, Remittance Journal.</w:t>
+        <w:t>Pastikan Fiscal Localization / Chart of Accounts sudah terpasang sebelum memetakan Report Category.</w:t>
       </w:r>
     </w:p>
     <w:p>
@@ -3426,15 +3664,7 @@
         <w:pStyle w:val="ListNumber"/>
       </w:pPr>
       <w:r>
-        <w:t>Security Deposit (per properti): set Deposit Liability Account, Forfeiture Income Account, Deposit Journal.</w:t>
-      </w:r>
-    </w:p>
-    <w:p>
-      <w:pPr>
-        <w:pStyle w:val="ListNumber"/>
-      </w:pPr>
-      <w:r>
-        <w:t>Buat Property Budget per akun/bulan (untuk Actual vs Budget); ajukan &amp; setujui (approval workflow).</w:t>
+        <w:t>Accounting → Configuration → Journals: siapkan jurnal Sales, Purchase, Bank, Miscellaneous; tambahkan jurnal khusus bila perlu (Trust, Remittance, Deposit, Depreciation).</w:t>
       </w:r>
     </w:p>
     <w:p>
@@ -3446,7 +3676,1087 @@
           <w:color w:val="006A4E"/>
           <w:sz w:val="25"/>
         </w:rPr>
-        <w:t>5.2 Produk Layanan (dibuat otomatis saat install; petakan akun pendapatannya)</w:t>
+        <w:t>5.2 Pemetaan Akun → Report Category Owners Statement (Wajib)</w:t>
+      </w:r>
+    </w:p>
+    <w:p>
+      <w:pPr>
+        <w:spacing w:after="120"/>
+      </w:pPr>
+      <w:r>
+        <w:rPr>
+          <w:b w:val="0"/>
+          <w:i w:val="0"/>
+          <w:sz w:val="21"/>
+        </w:rPr>
+        <w:t>Owners Statement mengelompokkan baris GL berdasarkan field "Property Report Category" (model property.financial.category) pada tiap akun. Tanpa pemetaan ini, angka tidak masuk section yang benar. Buat kategori di Properties → Financial → Report Categories lalu set pada akun (Accounting → Chart of Accounts → buka akun → field Property Report Category).</w:t>
+      </w:r>
+    </w:p>
+    <w:tbl>
+      <w:tblPr>
+        <w:tblStyle w:val="TableGrid"/>
+        <w:tblW w:type="auto" w:w="0"/>
+        <w:jc w:val="center"/>
+        <w:tblLook w:firstColumn="1" w:firstRow="1" w:lastColumn="0" w:lastRow="0" w:noHBand="0" w:noVBand="1" w:val="04A0"/>
+      </w:tblPr>
+      <w:tblGrid>
+        <w:gridCol w:w="2160"/>
+        <w:gridCol w:w="2160"/>
+        <w:gridCol w:w="2160"/>
+        <w:gridCol w:w="2160"/>
+      </w:tblGrid>
+      <w:tr>
+        <w:tc>
+          <w:tcPr>
+            <w:tcW w:type="dxa" w:w="2160"/>
+            <w:shd w:val="clear" w:color="auto" w:fill="1F3964"/>
+          </w:tcPr>
+          <w:p>
+            <w:r/>
+            <w:r>
+              <w:rPr>
+                <w:b/>
+                <w:color w:val="FFFFFF"/>
+                <w:sz w:val="18"/>
+              </w:rPr>
+              <w:t>Section Laporan</w:t>
+            </w:r>
+          </w:p>
+        </w:tc>
+        <w:tc>
+          <w:tcPr>
+            <w:tcW w:type="dxa" w:w="2160"/>
+            <w:shd w:val="clear" w:color="auto" w:fill="1F3964"/>
+          </w:tcPr>
+          <w:p>
+            <w:r/>
+            <w:r>
+              <w:rPr>
+                <w:b/>
+                <w:color w:val="FFFFFF"/>
+                <w:sz w:val="18"/>
+              </w:rPr>
+              <w:t>Tipe</w:t>
+            </w:r>
+          </w:p>
+        </w:tc>
+        <w:tc>
+          <w:tcPr>
+            <w:tcW w:type="dxa" w:w="2160"/>
+            <w:shd w:val="clear" w:color="auto" w:fill="1F3964"/>
+          </w:tcPr>
+          <w:p>
+            <w:r/>
+            <w:r>
+              <w:rPr>
+                <w:b/>
+                <w:color w:val="FFFFFF"/>
+                <w:sz w:val="18"/>
+              </w:rPr>
+              <w:t>Contoh Akun GL</w:t>
+            </w:r>
+          </w:p>
+        </w:tc>
+        <w:tc>
+          <w:tcPr>
+            <w:tcW w:type="dxa" w:w="2160"/>
+            <w:shd w:val="clear" w:color="auto" w:fill="1F3964"/>
+          </w:tcPr>
+          <w:p>
+            <w:r/>
+            <w:r>
+              <w:rPr>
+                <w:b/>
+                <w:color w:val="FFFFFF"/>
+                <w:sz w:val="18"/>
+              </w:rPr>
+              <w:t>Catatan</w:t>
+            </w:r>
+          </w:p>
+        </w:tc>
+      </w:tr>
+      <w:tr>
+        <w:tc>
+          <w:tcPr>
+            <w:tcW w:type="dxa" w:w="2448"/>
+          </w:tcPr>
+          <w:p>
+            <w:r/>
+            <w:r>
+              <w:rPr>
+                <w:b w:val="0"/>
+                <w:sz w:val="16"/>
+              </w:rPr>
+              <w:t>Rental Income</w:t>
+            </w:r>
+          </w:p>
+        </w:tc>
+        <w:tc>
+          <w:tcPr>
+            <w:tcW w:type="dxa" w:w="1152"/>
+          </w:tcPr>
+          <w:p>
+            <w:r/>
+            <w:r>
+              <w:rPr>
+                <w:b w:val="0"/>
+                <w:sz w:val="16"/>
+              </w:rPr>
+              <w:t>Income</w:t>
+            </w:r>
+          </w:p>
+        </w:tc>
+        <w:tc>
+          <w:tcPr>
+            <w:tcW w:type="dxa" w:w="3456"/>
+          </w:tcPr>
+          <w:p>
+            <w:r/>
+            <w:r>
+              <w:rPr>
+                <w:b w:val="0"/>
+                <w:sz w:val="16"/>
+              </w:rPr>
+              <w:t>4-xxxx Pendapatan Sewa</w:t>
+            </w:r>
+          </w:p>
+        </w:tc>
+        <w:tc>
+          <w:tcPr>
+            <w:tcW w:type="dxa" w:w="2592"/>
+          </w:tcPr>
+          <w:p>
+            <w:r/>
+            <w:r>
+              <w:rPr>
+                <w:b w:val="0"/>
+                <w:sz w:val="16"/>
+              </w:rPr>
+              <w:t>sewa pokok kontrak</w:t>
+            </w:r>
+          </w:p>
+        </w:tc>
+      </w:tr>
+      <w:tr>
+        <w:tc>
+          <w:tcPr>
+            <w:tcW w:type="dxa" w:w="2448"/>
+          </w:tcPr>
+          <w:p>
+            <w:r/>
+            <w:r>
+              <w:rPr>
+                <w:b w:val="0"/>
+                <w:sz w:val="16"/>
+              </w:rPr>
+              <w:t>Tenant Recharge Income</w:t>
+            </w:r>
+          </w:p>
+        </w:tc>
+        <w:tc>
+          <w:tcPr>
+            <w:tcW w:type="dxa" w:w="1152"/>
+          </w:tcPr>
+          <w:p>
+            <w:r/>
+            <w:r>
+              <w:rPr>
+                <w:b w:val="0"/>
+                <w:sz w:val="16"/>
+              </w:rPr>
+              <w:t>Income</w:t>
+            </w:r>
+          </w:p>
+        </w:tc>
+        <w:tc>
+          <w:tcPr>
+            <w:tcW w:type="dxa" w:w="3456"/>
+          </w:tcPr>
+          <w:p>
+            <w:r/>
+            <w:r>
+              <w:rPr>
+                <w:b w:val="0"/>
+                <w:sz w:val="16"/>
+              </w:rPr>
+              <w:t>4-xxxx Recharge Utilitas/CAM</w:t>
+            </w:r>
+          </w:p>
+        </w:tc>
+        <w:tc>
+          <w:tcPr>
+            <w:tcW w:type="dxa" w:w="2592"/>
+          </w:tcPr>
+          <w:p>
+            <w:r/>
+            <w:r>
+              <w:rPr>
+                <w:b w:val="0"/>
+                <w:sz w:val="16"/>
+              </w:rPr>
+              <w:t>meter, CAM, service charge</w:t>
+            </w:r>
+          </w:p>
+        </w:tc>
+      </w:tr>
+      <w:tr>
+        <w:tc>
+          <w:tcPr>
+            <w:tcW w:type="dxa" w:w="2448"/>
+          </w:tcPr>
+          <w:p>
+            <w:r/>
+            <w:r>
+              <w:rPr>
+                <w:b w:val="0"/>
+                <w:sz w:val="16"/>
+              </w:rPr>
+              <w:t>Other / GTO Income</w:t>
+            </w:r>
+          </w:p>
+        </w:tc>
+        <w:tc>
+          <w:tcPr>
+            <w:tcW w:type="dxa" w:w="1152"/>
+          </w:tcPr>
+          <w:p>
+            <w:r/>
+            <w:r>
+              <w:rPr>
+                <w:b w:val="0"/>
+                <w:sz w:val="16"/>
+              </w:rPr>
+              <w:t>Income</w:t>
+            </w:r>
+          </w:p>
+        </w:tc>
+        <w:tc>
+          <w:tcPr>
+            <w:tcW w:type="dxa" w:w="3456"/>
+          </w:tcPr>
+          <w:p>
+            <w:r/>
+            <w:r>
+              <w:rPr>
+                <w:b w:val="0"/>
+                <w:sz w:val="16"/>
+              </w:rPr>
+              <w:t>4-xxxx Pendapatan GTO/Parkir</w:t>
+            </w:r>
+          </w:p>
+        </w:tc>
+        <w:tc>
+          <w:tcPr>
+            <w:tcW w:type="dxa" w:w="2592"/>
+          </w:tcPr>
+          <w:p>
+            <w:r/>
+            <w:r>
+              <w:rPr>
+                <w:b w:val="0"/>
+                <w:sz w:val="16"/>
+              </w:rPr>
+              <w:t>GTO, parkir, casual lease</w:t>
+            </w:r>
+          </w:p>
+        </w:tc>
+      </w:tr>
+      <w:tr>
+        <w:tc>
+          <w:tcPr>
+            <w:tcW w:type="dxa" w:w="2448"/>
+          </w:tcPr>
+          <w:p>
+            <w:r/>
+            <w:r>
+              <w:rPr>
+                <w:b w:val="0"/>
+                <w:sz w:val="16"/>
+              </w:rPr>
+              <w:t>Property Expenses</w:t>
+            </w:r>
+          </w:p>
+        </w:tc>
+        <w:tc>
+          <w:tcPr>
+            <w:tcW w:type="dxa" w:w="1152"/>
+          </w:tcPr>
+          <w:p>
+            <w:r/>
+            <w:r>
+              <w:rPr>
+                <w:b w:val="0"/>
+                <w:sz w:val="16"/>
+              </w:rPr>
+              <w:t>Expense</w:t>
+            </w:r>
+          </w:p>
+        </w:tc>
+        <w:tc>
+          <w:tcPr>
+            <w:tcW w:type="dxa" w:w="3456"/>
+          </w:tcPr>
+          <w:p>
+            <w:r/>
+            <w:r>
+              <w:rPr>
+                <w:b w:val="0"/>
+                <w:sz w:val="16"/>
+              </w:rPr>
+              <w:t>6-xxxx Beban O&amp;M, utilitas</w:t>
+            </w:r>
+          </w:p>
+        </w:tc>
+        <w:tc>
+          <w:tcPr>
+            <w:tcW w:type="dxa" w:w="2592"/>
+          </w:tcPr>
+          <w:p>
+            <w:r/>
+            <w:r>
+              <w:rPr>
+                <w:b w:val="0"/>
+                <w:sz w:val="16"/>
+              </w:rPr>
+              <w:t>maintenance, utilitas, kebersihan</w:t>
+            </w:r>
+          </w:p>
+        </w:tc>
+      </w:tr>
+      <w:tr>
+        <w:tc>
+          <w:tcPr>
+            <w:tcW w:type="dxa" w:w="2448"/>
+          </w:tcPr>
+          <w:p>
+            <w:r/>
+            <w:r>
+              <w:rPr>
+                <w:b w:val="0"/>
+                <w:sz w:val="16"/>
+              </w:rPr>
+              <w:t>Management Fee</w:t>
+            </w:r>
+          </w:p>
+        </w:tc>
+        <w:tc>
+          <w:tcPr>
+            <w:tcW w:type="dxa" w:w="1152"/>
+          </w:tcPr>
+          <w:p>
+            <w:r/>
+            <w:r>
+              <w:rPr>
+                <w:b w:val="0"/>
+                <w:sz w:val="16"/>
+              </w:rPr>
+              <w:t>Expense</w:t>
+            </w:r>
+          </w:p>
+        </w:tc>
+        <w:tc>
+          <w:tcPr>
+            <w:tcW w:type="dxa" w:w="3456"/>
+          </w:tcPr>
+          <w:p>
+            <w:r/>
+            <w:r>
+              <w:rPr>
+                <w:b w:val="0"/>
+                <w:sz w:val="16"/>
+              </w:rPr>
+              <w:t>6-xxxx Management Fee</w:t>
+            </w:r>
+          </w:p>
+        </w:tc>
+        <w:tc>
+          <w:tcPr>
+            <w:tcW w:type="dxa" w:w="2592"/>
+          </w:tcPr>
+          <w:p>
+            <w:r/>
+            <w:r>
+              <w:rPr>
+                <w:b w:val="0"/>
+                <w:sz w:val="16"/>
+              </w:rPr>
+              <w:t>fee pengelola</w:t>
+            </w:r>
+          </w:p>
+        </w:tc>
+      </w:tr>
+      <w:tr>
+        <w:tc>
+          <w:tcPr>
+            <w:tcW w:type="dxa" w:w="2448"/>
+          </w:tcPr>
+          <w:p>
+            <w:r/>
+            <w:r>
+              <w:rPr>
+                <w:b w:val="0"/>
+                <w:sz w:val="16"/>
+              </w:rPr>
+              <w:t>Capital Expenditure</w:t>
+            </w:r>
+          </w:p>
+        </w:tc>
+        <w:tc>
+          <w:tcPr>
+            <w:tcW w:type="dxa" w:w="1152"/>
+          </w:tcPr>
+          <w:p>
+            <w:r/>
+            <w:r>
+              <w:rPr>
+                <w:b w:val="0"/>
+                <w:sz w:val="16"/>
+              </w:rPr>
+              <w:t>Capital</w:t>
+            </w:r>
+          </w:p>
+        </w:tc>
+        <w:tc>
+          <w:tcPr>
+            <w:tcW w:type="dxa" w:w="3456"/>
+          </w:tcPr>
+          <w:p>
+            <w:r/>
+            <w:r>
+              <w:rPr>
+                <w:b w:val="0"/>
+                <w:sz w:val="16"/>
+              </w:rPr>
+              <w:t>1-xxxx CWIP / Aset</w:t>
+            </w:r>
+          </w:p>
+        </w:tc>
+        <w:tc>
+          <w:tcPr>
+            <w:tcW w:type="dxa" w:w="2592"/>
+          </w:tcPr>
+          <w:p>
+            <w:r/>
+            <w:r>
+              <w:rPr>
+                <w:b w:val="0"/>
+                <w:sz w:val="16"/>
+              </w:rPr>
+              <w:t>pengeluaran kapital (di bawah Net Cash)</w:t>
+            </w:r>
+          </w:p>
+        </w:tc>
+      </w:tr>
+      <w:tr>
+        <w:tc>
+          <w:tcPr>
+            <w:tcW w:type="dxa" w:w="2448"/>
+          </w:tcPr>
+          <w:p>
+            <w:r/>
+            <w:r>
+              <w:rPr>
+                <w:b w:val="0"/>
+                <w:sz w:val="16"/>
+              </w:rPr>
+              <w:t>GST/PPN Control</w:t>
+            </w:r>
+          </w:p>
+        </w:tc>
+        <w:tc>
+          <w:tcPr>
+            <w:tcW w:type="dxa" w:w="1152"/>
+          </w:tcPr>
+          <w:p>
+            <w:r/>
+            <w:r>
+              <w:rPr>
+                <w:b w:val="0"/>
+                <w:sz w:val="16"/>
+              </w:rPr>
+              <w:t>Tax</w:t>
+            </w:r>
+          </w:p>
+        </w:tc>
+        <w:tc>
+          <w:tcPr>
+            <w:tcW w:type="dxa" w:w="3456"/>
+          </w:tcPr>
+          <w:p>
+            <w:r/>
+            <w:r>
+              <w:rPr>
+                <w:b w:val="0"/>
+                <w:sz w:val="16"/>
+              </w:rPr>
+              <w:t>2-xxxx PPN Keluaran/Masukan</w:t>
+            </w:r>
+          </w:p>
+        </w:tc>
+        <w:tc>
+          <w:tcPr>
+            <w:tcW w:type="dxa" w:w="2592"/>
+          </w:tcPr>
+          <w:p>
+            <w:r/>
+            <w:r>
+              <w:rPr>
+                <w:b w:val="0"/>
+                <w:sz w:val="16"/>
+              </w:rPr>
+              <w:t>untuk GST Reconciliation</w:t>
+            </w:r>
+          </w:p>
+        </w:tc>
+      </w:tr>
+    </w:tbl>
+    <w:p/>
+    <w:p>
+      <w:pPr>
+        <w:pStyle w:val="ListBullet"/>
+      </w:pPr>
+      <w:r>
+        <w:t>Sub-group: gunakan field parent pada kategori untuk membentuk hierarki section/sub-group (struktur MR-style).</w:t>
+      </w:r>
+    </w:p>
+    <w:p>
+      <w:pPr>
+        <w:pStyle w:val="ListBullet"/>
+      </w:pPr>
+      <w:r>
+        <w:t>Akun trust/deposit/remittance TIDAK dipetakan ke Income/Expense (lihat 5.4–5.5) agar tidak terhitung sebagai pendapatan.</w:t>
+      </w:r>
+    </w:p>
+    <w:p>
+      <w:pPr>
+        <w:pStyle w:val="Heading2"/>
+      </w:pPr>
+      <w:r>
+        <w:rPr>
+          <w:color w:val="006A4E"/>
+          <w:sz w:val="25"/>
+        </w:rPr>
+        <w:t>5.3 Konfigurasi per Properti (Wajib)</w:t>
+      </w:r>
+    </w:p>
+    <w:p>
+      <w:pPr>
+        <w:pStyle w:val="ListNumber"/>
+      </w:pPr>
+      <w:r>
+        <w:t>Buka properti → tab "Owners &amp; Financial".</w:t>
+      </w:r>
+    </w:p>
+    <w:p>
+      <w:pPr>
+        <w:pStyle w:val="ListNumber"/>
+      </w:pPr>
+      <w:r>
+        <w:t>Owners: tambahkan baris pemilik + ownership % (total harus 100%). Isi Property Manager, telepon, faks (tampil di kop Owners Statement).</w:t>
+      </w:r>
+    </w:p>
+    <w:p>
+      <w:pPr>
+        <w:pStyle w:val="ListNumber"/>
+      </w:pPr>
+      <w:r>
+        <w:t>Klik "Create Analytic Account" → membuat account.analytic.account khusus properti (dipakai stamping otomatis).</w:t>
+      </w:r>
+    </w:p>
+    <w:p>
+      <w:pPr>
+        <w:pStyle w:val="ListNumber"/>
+      </w:pPr>
+      <w:r>
+        <w:t>Isi data fisik (luas/area) bila memakai CAM apportionment by area.</w:t>
+      </w:r>
+    </w:p>
+    <w:p>
+      <w:pPr>
+        <w:pStyle w:val="Heading2"/>
+      </w:pPr>
+      <w:r>
+        <w:rPr>
+          <w:color w:val="006A4E"/>
+          <w:sz w:val="25"/>
+        </w:rPr>
+        <w:t>5.4 Trust Accounting &amp; Owner Remittance (Wajib bila pakai trust)</w:t>
+      </w:r>
+    </w:p>
+    <w:tbl>
+      <w:tblPr>
+        <w:tblStyle w:val="TableGrid"/>
+        <w:tblW w:type="auto" w:w="0"/>
+        <w:jc w:val="center"/>
+        <w:tblLook w:firstColumn="1" w:firstRow="1" w:lastColumn="0" w:lastRow="0" w:noHBand="0" w:noVBand="1" w:val="04A0"/>
+      </w:tblPr>
+      <w:tblGrid>
+        <w:gridCol w:w="2880"/>
+        <w:gridCol w:w="2880"/>
+        <w:gridCol w:w="2880"/>
+      </w:tblGrid>
+      <w:tr>
+        <w:tc>
+          <w:tcPr>
+            <w:tcW w:type="dxa" w:w="2880"/>
+            <w:shd w:val="clear" w:color="auto" w:fill="1F3964"/>
+          </w:tcPr>
+          <w:p>
+            <w:r/>
+            <w:r>
+              <w:rPr>
+                <w:b/>
+                <w:color w:val="FFFFFF"/>
+                <w:sz w:val="18"/>
+              </w:rPr>
+              <w:t>Field (per properti)</w:t>
+            </w:r>
+          </w:p>
+        </w:tc>
+        <w:tc>
+          <w:tcPr>
+            <w:tcW w:type="dxa" w:w="2880"/>
+            <w:shd w:val="clear" w:color="auto" w:fill="1F3964"/>
+          </w:tcPr>
+          <w:p>
+            <w:r/>
+            <w:r>
+              <w:rPr>
+                <w:b/>
+                <w:color w:val="FFFFFF"/>
+                <w:sz w:val="18"/>
+              </w:rPr>
+              <w:t>Tipe Akun</w:t>
+            </w:r>
+          </w:p>
+        </w:tc>
+        <w:tc>
+          <w:tcPr>
+            <w:tcW w:type="dxa" w:w="2880"/>
+            <w:shd w:val="clear" w:color="auto" w:fill="1F3964"/>
+          </w:tcPr>
+          <w:p>
+            <w:r/>
+            <w:r>
+              <w:rPr>
+                <w:b/>
+                <w:color w:val="FFFFFF"/>
+                <w:sz w:val="18"/>
+              </w:rPr>
+              <w:t>Fungsi</w:t>
+            </w:r>
+          </w:p>
+        </w:tc>
+      </w:tr>
+      <w:tr>
+        <w:tc>
+          <w:tcPr>
+            <w:tcW w:type="dxa" w:w="3024"/>
+          </w:tcPr>
+          <w:p>
+            <w:r/>
+            <w:r>
+              <w:rPr>
+                <w:b w:val="0"/>
+                <w:sz w:val="17"/>
+              </w:rPr>
+              <w:t>Trust Bank Account</w:t>
+            </w:r>
+          </w:p>
+        </w:tc>
+        <w:tc>
+          <w:tcPr>
+            <w:tcW w:type="dxa" w:w="2448"/>
+          </w:tcPr>
+          <w:p>
+            <w:r/>
+            <w:r>
+              <w:rPr>
+                <w:b w:val="0"/>
+                <w:sz w:val="17"/>
+              </w:rPr>
+              <w:t>Bank/Asset</w:t>
+            </w:r>
+          </w:p>
+        </w:tc>
+        <w:tc>
+          <w:tcPr>
+            <w:tcW w:type="dxa" w:w="4464"/>
+          </w:tcPr>
+          <w:p>
+            <w:r/>
+            <w:r>
+              <w:rPr>
+                <w:b w:val="0"/>
+                <w:sz w:val="17"/>
+              </w:rPr>
+              <w:t>rekening penampung dana milik owner</w:t>
+            </w:r>
+          </w:p>
+        </w:tc>
+      </w:tr>
+      <w:tr>
+        <w:tc>
+          <w:tcPr>
+            <w:tcW w:type="dxa" w:w="3024"/>
+          </w:tcPr>
+          <w:p>
+            <w:r/>
+            <w:r>
+              <w:rPr>
+                <w:b w:val="0"/>
+                <w:sz w:val="17"/>
+              </w:rPr>
+              <w:t>Owners Remittance Account</w:t>
+            </w:r>
+          </w:p>
+        </w:tc>
+        <w:tc>
+          <w:tcPr>
+            <w:tcW w:type="dxa" w:w="2448"/>
+          </w:tcPr>
+          <w:p>
+            <w:r/>
+            <w:r>
+              <w:rPr>
+                <w:b w:val="0"/>
+                <w:sz w:val="17"/>
+              </w:rPr>
+              <w:t>Liability/Payable</w:t>
+            </w:r>
+          </w:p>
+        </w:tc>
+        <w:tc>
+          <w:tcPr>
+            <w:tcW w:type="dxa" w:w="4464"/>
+          </w:tcPr>
+          <w:p>
+            <w:r/>
+            <w:r>
+              <w:rPr>
+                <w:b w:val="0"/>
+                <w:sz w:val="17"/>
+              </w:rPr>
+              <w:t>utang ke owner saat remittance</w:t>
+            </w:r>
+          </w:p>
+        </w:tc>
+      </w:tr>
+      <w:tr>
+        <w:tc>
+          <w:tcPr>
+            <w:tcW w:type="dxa" w:w="3024"/>
+          </w:tcPr>
+          <w:p>
+            <w:r/>
+            <w:r>
+              <w:rPr>
+                <w:b w:val="0"/>
+                <w:sz w:val="17"/>
+              </w:rPr>
+              <w:t>Remittance Journal</w:t>
+            </w:r>
+          </w:p>
+        </w:tc>
+        <w:tc>
+          <w:tcPr>
+            <w:tcW w:type="dxa" w:w="2448"/>
+          </w:tcPr>
+          <w:p>
+            <w:r/>
+            <w:r>
+              <w:rPr>
+                <w:b w:val="0"/>
+                <w:sz w:val="17"/>
+              </w:rPr>
+              <w:t>Journal (Misc/Bank)</w:t>
+            </w:r>
+          </w:p>
+        </w:tc>
+        <w:tc>
+          <w:tcPr>
+            <w:tcW w:type="dxa" w:w="4464"/>
+          </w:tcPr>
+          <w:p>
+            <w:r/>
+            <w:r>
+              <w:rPr>
+                <w:b w:val="0"/>
+                <w:sz w:val="17"/>
+              </w:rPr>
+              <w:t>jurnal posting remittance</w:t>
+            </w:r>
+          </w:p>
+        </w:tc>
+      </w:tr>
+    </w:tbl>
+    <w:p/>
+    <w:p>
+      <w:pPr>
+        <w:pStyle w:val="ListBullet"/>
+      </w:pPr>
+      <w:r>
+        <w:rPr>
+          <w:b/>
+        </w:rPr>
+        <w:t xml:space="preserve">Posting: </w:t>
+      </w:r>
+      <w:r>
+        <w:t>Posting remittance: Dr Owners Remittance / Cr Trust Bank. Multi-currency: pilih Remittance Currency; konversi ke mata uang perusahaan pada kurs tanggal remittance (amount_currency tercatat).</w:t>
+      </w:r>
+    </w:p>
+    <w:p>
+      <w:pPr>
+        <w:pStyle w:val="ListBullet"/>
+      </w:pPr>
+      <w:r>
+        <w:rPr>
+          <w:b/>
+        </w:rPr>
+        <w:t xml:space="preserve">Aritmetika: </w:t>
+      </w:r>
+      <w:r>
+        <w:t>Roll-forward: Opening Trust + Net Cash − Remittances = Closing Trust (tampil di Performance Summary Cash &amp; Trust).</w:t>
+      </w:r>
+    </w:p>
+    <w:p>
+      <w:pPr>
+        <w:pStyle w:val="Heading2"/>
+      </w:pPr>
+      <w:r>
+        <w:rPr>
+          <w:color w:val="006A4E"/>
+          <w:sz w:val="25"/>
+        </w:rPr>
+        <w:t>5.5 Security Deposit (Wajib bila pakai deposit)</w:t>
+      </w:r>
+    </w:p>
+    <w:tbl>
+      <w:tblPr>
+        <w:tblStyle w:val="TableGrid"/>
+        <w:tblW w:type="auto" w:w="0"/>
+        <w:jc w:val="center"/>
+        <w:tblLook w:firstColumn="1" w:firstRow="1" w:lastColumn="0" w:lastRow="0" w:noHBand="0" w:noVBand="1" w:val="04A0"/>
+      </w:tblPr>
+      <w:tblGrid>
+        <w:gridCol w:w="2880"/>
+        <w:gridCol w:w="2880"/>
+        <w:gridCol w:w="2880"/>
+      </w:tblGrid>
+      <w:tr>
+        <w:tc>
+          <w:tcPr>
+            <w:tcW w:type="dxa" w:w="2880"/>
+            <w:shd w:val="clear" w:color="auto" w:fill="1F3964"/>
+          </w:tcPr>
+          <w:p>
+            <w:r/>
+            <w:r>
+              <w:rPr>
+                <w:b/>
+                <w:color w:val="FFFFFF"/>
+                <w:sz w:val="18"/>
+              </w:rPr>
+              <w:t>Field (per properti)</w:t>
+            </w:r>
+          </w:p>
+        </w:tc>
+        <w:tc>
+          <w:tcPr>
+            <w:tcW w:type="dxa" w:w="2880"/>
+            <w:shd w:val="clear" w:color="auto" w:fill="1F3964"/>
+          </w:tcPr>
+          <w:p>
+            <w:r/>
+            <w:r>
+              <w:rPr>
+                <w:b/>
+                <w:color w:val="FFFFFF"/>
+                <w:sz w:val="18"/>
+              </w:rPr>
+              <w:t>Tipe Akun</w:t>
+            </w:r>
+          </w:p>
+        </w:tc>
+        <w:tc>
+          <w:tcPr>
+            <w:tcW w:type="dxa" w:w="2880"/>
+            <w:shd w:val="clear" w:color="auto" w:fill="1F3964"/>
+          </w:tcPr>
+          <w:p>
+            <w:r/>
+            <w:r>
+              <w:rPr>
+                <w:b/>
+                <w:color w:val="FFFFFF"/>
+                <w:sz w:val="18"/>
+              </w:rPr>
+              <w:t>Fungsi</w:t>
+            </w:r>
+          </w:p>
+        </w:tc>
+      </w:tr>
+      <w:tr>
+        <w:tc>
+          <w:tcPr>
+            <w:tcW w:type="dxa" w:w="3168"/>
+          </w:tcPr>
+          <w:p>
+            <w:r/>
+            <w:r>
+              <w:rPr>
+                <w:b w:val="0"/>
+                <w:sz w:val="17"/>
+              </w:rPr>
+              <w:t>Deposit Liability Account</w:t>
+            </w:r>
+          </w:p>
+        </w:tc>
+        <w:tc>
+          <w:tcPr>
+            <w:tcW w:type="dxa" w:w="2016"/>
+          </w:tcPr>
+          <w:p>
+            <w:r/>
+            <w:r>
+              <w:rPr>
+                <w:b w:val="0"/>
+                <w:sz w:val="17"/>
+              </w:rPr>
+              <w:t>Liability</w:t>
+            </w:r>
+          </w:p>
+        </w:tc>
+        <w:tc>
+          <w:tcPr>
+            <w:tcW w:type="dxa" w:w="4752"/>
+          </w:tcPr>
+          <w:p>
+            <w:r/>
+            <w:r>
+              <w:rPr>
+                <w:b w:val="0"/>
+                <w:sz w:val="17"/>
+              </w:rPr>
+              <w:t>deposit sebagai kewajiban (bukan income)</w:t>
+            </w:r>
+          </w:p>
+        </w:tc>
+      </w:tr>
+      <w:tr>
+        <w:tc>
+          <w:tcPr>
+            <w:tcW w:type="dxa" w:w="3168"/>
+          </w:tcPr>
+          <w:p>
+            <w:r/>
+            <w:r>
+              <w:rPr>
+                <w:b w:val="0"/>
+                <w:sz w:val="17"/>
+              </w:rPr>
+              <w:t>Forfeiture Income Account</w:t>
+            </w:r>
+          </w:p>
+        </w:tc>
+        <w:tc>
+          <w:tcPr>
+            <w:tcW w:type="dxa" w:w="2016"/>
+          </w:tcPr>
+          <w:p>
+            <w:r/>
+            <w:r>
+              <w:rPr>
+                <w:b w:val="0"/>
+                <w:sz w:val="17"/>
+              </w:rPr>
+              <w:t>Income</w:t>
+            </w:r>
+          </w:p>
+        </w:tc>
+        <w:tc>
+          <w:tcPr>
+            <w:tcW w:type="dxa" w:w="4752"/>
+          </w:tcPr>
+          <w:p>
+            <w:r/>
+            <w:r>
+              <w:rPr>
+                <w:b w:val="0"/>
+                <w:sz w:val="17"/>
+              </w:rPr>
+              <w:t>pengakuan deduction/forfeit</w:t>
+            </w:r>
+          </w:p>
+        </w:tc>
+      </w:tr>
+      <w:tr>
+        <w:tc>
+          <w:tcPr>
+            <w:tcW w:type="dxa" w:w="3168"/>
+          </w:tcPr>
+          <w:p>
+            <w:r/>
+            <w:r>
+              <w:rPr>
+                <w:b w:val="0"/>
+                <w:sz w:val="17"/>
+              </w:rPr>
+              <w:t>Deposit Journal</w:t>
+            </w:r>
+          </w:p>
+        </w:tc>
+        <w:tc>
+          <w:tcPr>
+            <w:tcW w:type="dxa" w:w="2016"/>
+          </w:tcPr>
+          <w:p>
+            <w:r/>
+            <w:r>
+              <w:rPr>
+                <w:b w:val="0"/>
+                <w:sz w:val="17"/>
+              </w:rPr>
+              <w:t>Journal</w:t>
+            </w:r>
+          </w:p>
+        </w:tc>
+        <w:tc>
+          <w:tcPr>
+            <w:tcW w:type="dxa" w:w="4752"/>
+          </w:tcPr>
+          <w:p>
+            <w:r/>
+            <w:r>
+              <w:rPr>
+                <w:b w:val="0"/>
+                <w:sz w:val="17"/>
+              </w:rPr>
+              <w:t>jurnal held/refund/deduction</w:t>
+            </w:r>
+          </w:p>
+        </w:tc>
+      </w:tr>
+    </w:tbl>
+    <w:p/>
+    <w:p>
+      <w:pPr>
+        <w:pStyle w:val="ListBullet"/>
+      </w:pPr>
+      <w:r>
+        <w:t>Alur: Mark as Held (Dr Bank/Cr Deposit Liability) → Deduction (Dr Liability/Cr Forfeiture Income) → Refund (Dr Liability/Cr Bank). Saldo muncul di kolom Sec Dep Bal pada Tenant Balances.</w:t>
+      </w:r>
+    </w:p>
+    <w:p>
+      <w:pPr>
+        <w:pStyle w:val="Heading2"/>
+      </w:pPr>
+      <w:r>
+        <w:rPr>
+          <w:color w:val="006A4E"/>
+          <w:sz w:val="25"/>
+        </w:rPr>
+        <w:t>5.6 Produk Layanan (petakan income account-nya)</w:t>
       </w:r>
     </w:p>
     <w:tbl>
@@ -3509,7 +4819,7 @@
                 <w:color w:val="FFFFFF"/>
                 <w:sz w:val="18"/>
               </w:rPr>
-              <w:t>Catatan</w:t>
+              <w:t>Income Account → Report Category</w:t>
             </w:r>
           </w:p>
         </w:tc>
@@ -3524,7 +4834,7 @@
             <w:r>
               <w:rPr>
                 <w:b w:val="0"/>
-                <w:sz w:val="18"/>
+                <w:sz w:val="17"/>
               </w:rPr>
               <w:t>Percentage / GTO Rent</w:t>
             </w:r>
@@ -3532,14 +4842,14 @@
         </w:tc>
         <w:tc>
           <w:tcPr>
-            <w:tcW w:type="dxa" w:w="2592"/>
+            <w:tcW w:type="dxa" w:w="2016"/>
           </w:tcPr>
           <w:p>
             <w:r/>
             <w:r>
               <w:rPr>
                 <w:b w:val="0"/>
-                <w:sz w:val="18"/>
+                <w:sz w:val="17"/>
               </w:rPr>
               <w:t>gto_meter</w:t>
             </w:r>
@@ -3547,16 +4857,16 @@
         </w:tc>
         <w:tc>
           <w:tcPr>
-            <w:tcW w:type="dxa" w:w="4176"/>
+            <w:tcW w:type="dxa" w:w="4752"/>
           </w:tcPr>
           <w:p>
             <w:r/>
             <w:r>
               <w:rPr>
                 <w:b w:val="0"/>
-                <w:sz w:val="18"/>
+                <w:sz w:val="17"/>
               </w:rPr>
-              <w:t>pendapatan GTO</w:t>
+              <w:t>Other / GTO Income</w:t>
             </w:r>
           </w:p>
         </w:tc>
@@ -3571,7 +4881,7 @@
             <w:r>
               <w:rPr>
                 <w:b w:val="0"/>
-                <w:sz w:val="18"/>
+                <w:sz w:val="17"/>
               </w:rPr>
               <w:t>Utility Recharge</w:t>
             </w:r>
@@ -3579,14 +4889,14 @@
         </w:tc>
         <w:tc>
           <w:tcPr>
-            <w:tcW w:type="dxa" w:w="2592"/>
+            <w:tcW w:type="dxa" w:w="2016"/>
           </w:tcPr>
           <w:p>
             <w:r/>
             <w:r>
               <w:rPr>
                 <w:b w:val="0"/>
-                <w:sz w:val="18"/>
+                <w:sz w:val="17"/>
               </w:rPr>
               <w:t>gto_meter</w:t>
             </w:r>
@@ -3594,16 +4904,16 @@
         </w:tc>
         <w:tc>
           <w:tcPr>
-            <w:tcW w:type="dxa" w:w="4176"/>
+            <w:tcW w:type="dxa" w:w="4752"/>
           </w:tcPr>
           <w:p>
             <w:r/>
             <w:r>
               <w:rPr>
                 <w:b w:val="0"/>
-                <w:sz w:val="18"/>
+                <w:sz w:val="17"/>
               </w:rPr>
-              <w:t>recharge meter</w:t>
+              <w:t>Tenant Recharge Income</w:t>
             </w:r>
           </w:p>
         </w:tc>
@@ -3618,7 +4928,7 @@
             <w:r>
               <w:rPr>
                 <w:b w:val="0"/>
-                <w:sz w:val="18"/>
+                <w:sz w:val="17"/>
               </w:rPr>
               <w:t>Casual Leasing</w:t>
             </w:r>
@@ -3626,14 +4936,14 @@
         </w:tc>
         <w:tc>
           <w:tcPr>
-            <w:tcW w:type="dxa" w:w="2592"/>
+            <w:tcW w:type="dxa" w:w="2016"/>
           </w:tcPr>
           <w:p>
             <w:r/>
             <w:r>
               <w:rPr>
                 <w:b w:val="0"/>
-                <w:sz w:val="18"/>
+                <w:sz w:val="17"/>
               </w:rPr>
               <w:t>casual_leasing</w:t>
             </w:r>
@@ -3641,16 +4951,16 @@
         </w:tc>
         <w:tc>
           <w:tcPr>
-            <w:tcW w:type="dxa" w:w="4176"/>
+            <w:tcW w:type="dxa" w:w="4752"/>
           </w:tcPr>
           <w:p>
             <w:r/>
             <w:r>
               <w:rPr>
                 <w:b w:val="0"/>
-                <w:sz w:val="18"/>
+                <w:sz w:val="17"/>
               </w:rPr>
-              <w:t>sewa jangka pendek</w:t>
+              <w:t>Other / GTO Income</w:t>
             </w:r>
           </w:p>
         </w:tc>
@@ -3665,7 +4975,7 @@
             <w:r>
               <w:rPr>
                 <w:b w:val="0"/>
-                <w:sz w:val="18"/>
+                <w:sz w:val="17"/>
               </w:rPr>
               <w:t>Service Charge / CAM</w:t>
             </w:r>
@@ -3673,14 +4983,14 @@
         </w:tc>
         <w:tc>
           <w:tcPr>
-            <w:tcW w:type="dxa" w:w="2592"/>
+            <w:tcW w:type="dxa" w:w="2016"/>
           </w:tcPr>
           <w:p>
             <w:r/>
             <w:r>
               <w:rPr>
                 <w:b w:val="0"/>
-                <w:sz w:val="18"/>
+                <w:sz w:val="17"/>
               </w:rPr>
               <w:t>cam</w:t>
             </w:r>
@@ -3688,16 +4998,16 @@
         </w:tc>
         <w:tc>
           <w:tcPr>
-            <w:tcW w:type="dxa" w:w="4176"/>
+            <w:tcW w:type="dxa" w:w="4752"/>
           </w:tcPr>
           <w:p>
             <w:r/>
             <w:r>
               <w:rPr>
                 <w:b w:val="0"/>
-                <w:sz w:val="18"/>
+                <w:sz w:val="17"/>
               </w:rPr>
-              <w:t>service charge</w:t>
+              <w:t>Tenant Recharge Income</w:t>
             </w:r>
           </w:p>
         </w:tc>
@@ -3712,7 +5022,7 @@
             <w:r>
               <w:rPr>
                 <w:b w:val="0"/>
-                <w:sz w:val="18"/>
+                <w:sz w:val="17"/>
               </w:rPr>
               <w:t>Parking Rental</w:t>
             </w:r>
@@ -3720,14 +5030,14 @@
         </w:tc>
         <w:tc>
           <w:tcPr>
-            <w:tcW w:type="dxa" w:w="2592"/>
+            <w:tcW w:type="dxa" w:w="2016"/>
           </w:tcPr>
           <w:p>
             <w:r/>
             <w:r>
               <w:rPr>
                 <w:b w:val="0"/>
-                <w:sz w:val="18"/>
+                <w:sz w:val="17"/>
               </w:rPr>
               <w:t>parking</w:t>
             </w:r>
@@ -3735,16 +5045,16 @@
         </w:tc>
         <w:tc>
           <w:tcPr>
-            <w:tcW w:type="dxa" w:w="4176"/>
+            <w:tcW w:type="dxa" w:w="4752"/>
           </w:tcPr>
           <w:p>
             <w:r/>
             <w:r>
               <w:rPr>
                 <w:b w:val="0"/>
-                <w:sz w:val="18"/>
+                <w:sz w:val="17"/>
               </w:rPr>
-              <w:t>sewa parkir</w:t>
+              <w:t>Other / GTO Income</w:t>
             </w:r>
           </w:p>
         </w:tc>
@@ -3759,7 +5069,7 @@
             <w:r>
               <w:rPr>
                 <w:b w:val="0"/>
-                <w:sz w:val="18"/>
+                <w:sz w:val="17"/>
               </w:rPr>
               <w:t>Late Payment Fee</w:t>
             </w:r>
@@ -3767,14 +5077,14 @@
         </w:tc>
         <w:tc>
           <w:tcPr>
-            <w:tcW w:type="dxa" w:w="2592"/>
+            <w:tcW w:type="dxa" w:w="2016"/>
           </w:tcPr>
           <w:p>
             <w:r/>
             <w:r>
               <w:rPr>
                 <w:b w:val="0"/>
-                <w:sz w:val="18"/>
+                <w:sz w:val="17"/>
               </w:rPr>
               <w:t>dunning</w:t>
             </w:r>
@@ -3782,16 +5092,16 @@
         </w:tc>
         <w:tc>
           <w:tcPr>
-            <w:tcW w:type="dxa" w:w="4176"/>
+            <w:tcW w:type="dxa" w:w="4752"/>
           </w:tcPr>
           <w:p>
             <w:r/>
             <w:r>
               <w:rPr>
                 <w:b w:val="0"/>
-                <w:sz w:val="18"/>
+                <w:sz w:val="17"/>
               </w:rPr>
-              <w:t>denda keterlambatan</w:t>
+              <w:t>Other Income</w:t>
             </w:r>
           </w:p>
         </w:tc>
@@ -3809,7 +5119,7 @@
           <w:color w:val="555555"/>
           <w:sz w:val="21"/>
         </w:rPr>
-        <w:t>Petakan income account tiap produk ke Property Report Category yang sesuai (mis. Tenant Recharge Income, Rental Income) agar masuk section yang benar di Owners Statement.</w:t>
+        <w:t>Buka tiap produk (otomatis dibuat saat install) → tab Accounting → set Income Account, lalu pastikan akun tersebut sudah dipetakan ke Property Report Category (5.2).</w:t>
       </w:r>
     </w:p>
     <w:p>
@@ -3821,7 +5131,91 @@
           <w:color w:val="006A4E"/>
           <w:sz w:val="25"/>
         </w:rPr>
-        <w:t>5.3 Scheduled Actions (Cron) — aktifkan/atur intervalnya</w:t>
+        <w:t>5.7 GTO / Revenue Sharing &amp; Meter</w:t>
+      </w:r>
+    </w:p>
+    <w:p>
+      <w:pPr>
+        <w:pStyle w:val="ListBullet"/>
+      </w:pPr>
+      <w:r>
+        <w:rPr>
+          <w:b/>
+        </w:rPr>
+        <w:t xml:space="preserve">GTO: </w:t>
+      </w:r>
+      <w:r>
+        <w:t>Di kontrak (tenancy) tab GTO: aktifkan GTO, pilih tipe (Higher-of / Base+Overage / Pure %), isi Turnover % dan Breakpoint (untuk Base+Overage), pilih produk GTO.</w:t>
+      </w:r>
+    </w:p>
+    <w:p>
+      <w:pPr>
+        <w:pStyle w:val="ListBullet"/>
+      </w:pPr>
+      <w:r>
+        <w:rPr>
+          <w:b/>
+        </w:rPr>
+        <w:t xml:space="preserve">Meter: </w:t>
+      </w:r>
+      <w:r>
+        <w:t>Meter: daftarkan per properti (jenis listrik/air/gas), pilih produk recharge &amp; tarif per unit; reading berikut mengambil previous otomatis.</w:t>
+      </w:r>
+    </w:p>
+    <w:p>
+      <w:pPr>
+        <w:pStyle w:val="Heading2"/>
+      </w:pPr>
+      <w:r>
+        <w:rPr>
+          <w:color w:val="006A4E"/>
+          <w:sz w:val="25"/>
+        </w:rPr>
+        <w:t>5.8 CAM / Service Charge</w:t>
+      </w:r>
+    </w:p>
+    <w:p>
+      <w:pPr>
+        <w:pStyle w:val="ListNumber"/>
+      </w:pPr>
+      <w:r>
+        <w:t>Set produk Service Charge &amp; income account-nya.</w:t>
+      </w:r>
+    </w:p>
+    <w:p>
+      <w:pPr>
+        <w:pStyle w:val="ListNumber"/>
+      </w:pPr>
+      <w:r>
+        <w:t>Isi Total Area properti dan area tiap tenant (untuk apportionment by area).</w:t>
+      </w:r>
+    </w:p>
+    <w:p>
+      <w:pPr>
+        <w:pStyle w:val="ListNumber"/>
+      </w:pPr>
+      <w:r>
+        <w:t>Buat pool biaya CAM per periode (budget), masukkan actual; selisih untuk rekonsiliasi.</w:t>
+      </w:r>
+    </w:p>
+    <w:p>
+      <w:pPr>
+        <w:pStyle w:val="ListNumber"/>
+      </w:pPr>
+      <w:r>
+        <w:t>Apportion → tinjau alokasi per tenant → Create Invoices.</w:t>
+      </w:r>
+    </w:p>
+    <w:p>
+      <w:pPr>
+        <w:pStyle w:val="Heading2"/>
+      </w:pPr>
+      <w:r>
+        <w:rPr>
+          <w:color w:val="006A4E"/>
+          <w:sz w:val="25"/>
+        </w:rPr>
+        <w:t>5.9 Fixed Asset &amp; Depreciation</w:t>
       </w:r>
     </w:p>
     <w:tbl>
@@ -3832,14 +5226,13 @@
         <w:tblLook w:firstColumn="1" w:firstRow="1" w:lastColumn="0" w:lastRow="0" w:noHBand="0" w:noVBand="1" w:val="04A0"/>
       </w:tblPr>
       <w:tblGrid>
-        <w:gridCol w:w="2880"/>
-        <w:gridCol w:w="2880"/>
-        <w:gridCol w:w="2880"/>
+        <w:gridCol w:w="4320"/>
+        <w:gridCol w:w="4320"/>
       </w:tblGrid>
       <w:tr>
         <w:tc>
           <w:tcPr>
-            <w:tcW w:type="dxa" w:w="2880"/>
+            <w:tcW w:type="dxa" w:w="4320"/>
             <w:shd w:val="clear" w:color="auto" w:fill="1F3964"/>
           </w:tcPr>
           <w:p>
@@ -3850,30 +5243,13 @@
                 <w:color w:val="FFFFFF"/>
                 <w:sz w:val="18"/>
               </w:rPr>
-              <w:t>Cron</w:t>
+              <w:t>Field</w:t>
             </w:r>
           </w:p>
         </w:tc>
         <w:tc>
           <w:tcPr>
-            <w:tcW w:type="dxa" w:w="2880"/>
-            <w:shd w:val="clear" w:color="auto" w:fill="1F3964"/>
-          </w:tcPr>
-          <w:p>
-            <w:r/>
-            <w:r>
-              <w:rPr>
-                <w:b/>
-                <w:color w:val="FFFFFF"/>
-                <w:sz w:val="18"/>
-              </w:rPr>
-              <w:t>Modul</w:t>
-            </w:r>
-          </w:p>
-        </w:tc>
-        <w:tc>
-          <w:tcPr>
-            <w:tcW w:type="dxa" w:w="2880"/>
+            <w:tcW w:type="dxa" w:w="4320"/>
             <w:shd w:val="clear" w:color="auto" w:fill="1F3964"/>
           </w:tcPr>
           <w:p>
@@ -3892,7 +5268,7 @@
       <w:tr>
         <w:tc>
           <w:tcPr>
-            <w:tcW w:type="dxa" w:w="3456"/>
+            <w:tcW w:type="dxa" w:w="3744"/>
           </w:tcPr>
           <w:p>
             <w:r/>
@@ -3901,13 +5277,13 @@
                 <w:b w:val="0"/>
                 <w:sz w:val="17"/>
               </w:rPr>
-              <w:t>Apply Due Rent Escalations</w:t>
+              <w:t>Asset / Gross Value Account</w:t>
             </w:r>
           </w:p>
         </w:tc>
         <w:tc>
           <w:tcPr>
-            <w:tcW w:type="dxa" w:w="2160"/>
+            <w:tcW w:type="dxa" w:w="5904"/>
           </w:tcPr>
           <w:p>
             <w:r/>
@@ -3916,13 +5292,15 @@
                 <w:b w:val="0"/>
                 <w:sz w:val="17"/>
               </w:rPr>
-              <w:t>rent_escalation</w:t>
+              <w:t>nilai perolehan aset</w:t>
             </w:r>
           </w:p>
         </w:tc>
+      </w:tr>
+      <w:tr>
         <w:tc>
           <w:tcPr>
-            <w:tcW w:type="dxa" w:w="4032"/>
+            <w:tcW w:type="dxa" w:w="3744"/>
           </w:tcPr>
           <w:p>
             <w:r/>
@@ -3931,15 +5309,13 @@
                 <w:b w:val="0"/>
                 <w:sz w:val="17"/>
               </w:rPr>
-              <w:t>naikkan sewa terjadwal</w:t>
+              <w:t>Accumulated Depreciation Account</w:t>
             </w:r>
           </w:p>
         </w:tc>
-      </w:tr>
-      <w:tr>
         <w:tc>
           <w:tcPr>
-            <w:tcW w:type="dxa" w:w="3456"/>
+            <w:tcW w:type="dxa" w:w="5904"/>
           </w:tcPr>
           <w:p>
             <w:r/>
@@ -3948,13 +5324,15 @@
                 <w:b w:val="0"/>
                 <w:sz w:val="17"/>
               </w:rPr>
-              <w:t>Run Dunning</w:t>
+              <w:t>akumulasi penyusutan (Cr)</w:t>
             </w:r>
           </w:p>
         </w:tc>
+      </w:tr>
+      <w:tr>
         <w:tc>
           <w:tcPr>
-            <w:tcW w:type="dxa" w:w="2160"/>
+            <w:tcW w:type="dxa" w:w="3744"/>
           </w:tcPr>
           <w:p>
             <w:r/>
@@ -3963,13 +5341,13 @@
                 <w:b w:val="0"/>
                 <w:sz w:val="17"/>
               </w:rPr>
-              <w:t>dunning</w:t>
+              <w:t>Depreciation Expense Account</w:t>
             </w:r>
           </w:p>
         </w:tc>
         <w:tc>
           <w:tcPr>
-            <w:tcW w:type="dxa" w:w="4032"/>
+            <w:tcW w:type="dxa" w:w="5904"/>
           </w:tcPr>
           <w:p>
             <w:r/>
@@ -3978,7 +5356,7 @@
                 <w:b w:val="0"/>
                 <w:sz w:val="17"/>
               </w:rPr>
-              <w:t>kirim reminder + late fee</w:t>
+              <w:t>beban penyusutan (Dr)</w:t>
             </w:r>
           </w:p>
         </w:tc>
@@ -3986,7 +5364,7 @@
       <w:tr>
         <w:tc>
           <w:tcPr>
-            <w:tcW w:type="dxa" w:w="3456"/>
+            <w:tcW w:type="dxa" w:w="3744"/>
           </w:tcPr>
           <w:p>
             <w:r/>
@@ -3995,13 +5373,13 @@
                 <w:b w:val="0"/>
                 <w:sz w:val="17"/>
               </w:rPr>
-              <w:t>Generate Preventive Maintenance</w:t>
+              <w:t>Revaluation Reserve Account</w:t>
             </w:r>
           </w:p>
         </w:tc>
         <w:tc>
           <w:tcPr>
-            <w:tcW w:type="dxa" w:w="2160"/>
+            <w:tcW w:type="dxa" w:w="5904"/>
           </w:tcPr>
           <w:p>
             <w:r/>
@@ -4010,13 +5388,15 @@
                 <w:b w:val="0"/>
                 <w:sz w:val="17"/>
               </w:rPr>
-              <w:t>ppm</w:t>
+              <w:t>cadangan revaluasi (naik/turun)</w:t>
             </w:r>
           </w:p>
         </w:tc>
+      </w:tr>
+      <w:tr>
         <w:tc>
           <w:tcPr>
-            <w:tcW w:type="dxa" w:w="4032"/>
+            <w:tcW w:type="dxa" w:w="3744"/>
           </w:tcPr>
           <w:p>
             <w:r/>
@@ -4025,15 +5405,13 @@
                 <w:b w:val="0"/>
                 <w:sz w:val="17"/>
               </w:rPr>
-              <w:t>buat maintenance request</w:t>
+              <w:t>Depreciation Journal</w:t>
             </w:r>
           </w:p>
         </w:tc>
-      </w:tr>
-      <w:tr>
         <w:tc>
           <w:tcPr>
-            <w:tcW w:type="dxa" w:w="3456"/>
+            <w:tcW w:type="dxa" w:w="5904"/>
           </w:tcPr>
           <w:p>
             <w:r/>
@@ -4042,13 +5420,15 @@
                 <w:b w:val="0"/>
                 <w:sz w:val="17"/>
               </w:rPr>
-              <w:t>Guarantee Check Expiry</w:t>
+              <w:t>jurnal posting penyusutan &amp; revaluasi</w:t>
             </w:r>
           </w:p>
         </w:tc>
+      </w:tr>
+      <w:tr>
         <w:tc>
           <w:tcPr>
-            <w:tcW w:type="dxa" w:w="2160"/>
+            <w:tcW w:type="dxa" w:w="3744"/>
           </w:tcPr>
           <w:p>
             <w:r/>
@@ -4057,13 +5437,13 @@
                 <w:b w:val="0"/>
                 <w:sz w:val="17"/>
               </w:rPr>
-              <w:t>guarantee</w:t>
+              <w:t>Method / Number / Period</w:t>
             </w:r>
           </w:p>
         </w:tc>
         <w:tc>
           <w:tcPr>
-            <w:tcW w:type="dxa" w:w="4032"/>
+            <w:tcW w:type="dxa" w:w="5904"/>
           </w:tcPr>
           <w:p>
             <w:r/>
@@ -4072,148 +5452,7 @@
                 <w:b w:val="0"/>
                 <w:sz w:val="17"/>
               </w:rPr>
-              <w:t>expire + reminder</w:t>
-            </w:r>
-          </w:p>
-        </w:tc>
-      </w:tr>
-      <w:tr>
-        <w:tc>
-          <w:tcPr>
-            <w:tcW w:type="dxa" w:w="3456"/>
-          </w:tcPr>
-          <w:p>
-            <w:r/>
-            <w:r>
-              <w:rPr>
-                <w:b w:val="0"/>
-                <w:sz w:val="17"/>
-              </w:rPr>
-              <w:t>Insurance Check Expiry</w:t>
-            </w:r>
-          </w:p>
-        </w:tc>
-        <w:tc>
-          <w:tcPr>
-            <w:tcW w:type="dxa" w:w="2160"/>
-          </w:tcPr>
-          <w:p>
-            <w:r/>
-            <w:r>
-              <w:rPr>
-                <w:b w:val="0"/>
-                <w:sz w:val="17"/>
-              </w:rPr>
-              <w:t>insurance</w:t>
-            </w:r>
-          </w:p>
-        </w:tc>
-        <w:tc>
-          <w:tcPr>
-            <w:tcW w:type="dxa" w:w="4032"/>
-          </w:tcPr>
-          <w:p>
-            <w:r/>
-            <w:r>
-              <w:rPr>
-                <w:b w:val="0"/>
-                <w:sz w:val="17"/>
-              </w:rPr>
-              <w:t>expire + reminder</w:t>
-            </w:r>
-          </w:p>
-        </w:tc>
-      </w:tr>
-      <w:tr>
-        <w:tc>
-          <w:tcPr>
-            <w:tcW w:type="dxa" w:w="3456"/>
-          </w:tcPr>
-          <w:p>
-            <w:r/>
-            <w:r>
-              <w:rPr>
-                <w:b w:val="0"/>
-                <w:sz w:val="17"/>
-              </w:rPr>
-              <w:t>Lease Expiry / Renewal Reminder</w:t>
-            </w:r>
-          </w:p>
-        </w:tc>
-        <w:tc>
-          <w:tcPr>
-            <w:tcW w:type="dxa" w:w="2160"/>
-          </w:tcPr>
-          <w:p>
-            <w:r/>
-            <w:r>
-              <w:rPr>
-                <w:b w:val="0"/>
-                <w:sz w:val="17"/>
-              </w:rPr>
-              <w:t>lease_expiry</w:t>
-            </w:r>
-          </w:p>
-        </w:tc>
-        <w:tc>
-          <w:tcPr>
-            <w:tcW w:type="dxa" w:w="4032"/>
-          </w:tcPr>
-          <w:p>
-            <w:r/>
-            <w:r>
-              <w:rPr>
-                <w:b w:val="0"/>
-                <w:sz w:val="17"/>
-              </w:rPr>
-              <w:t>aktivitas perpanjangan</w:t>
-            </w:r>
-          </w:p>
-        </w:tc>
-      </w:tr>
-      <w:tr>
-        <w:tc>
-          <w:tcPr>
-            <w:tcW w:type="dxa" w:w="3456"/>
-          </w:tcPr>
-          <w:p>
-            <w:r/>
-            <w:r>
-              <w:rPr>
-                <w:b w:val="0"/>
-                <w:sz w:val="17"/>
-              </w:rPr>
-              <w:t>Post Due Depreciation</w:t>
-            </w:r>
-          </w:p>
-        </w:tc>
-        <w:tc>
-          <w:tcPr>
-            <w:tcW w:type="dxa" w:w="2160"/>
-          </w:tcPr>
-          <w:p>
-            <w:r/>
-            <w:r>
-              <w:rPr>
-                <w:b w:val="0"/>
-                <w:sz w:val="17"/>
-              </w:rPr>
-              <w:t>asset</w:t>
-            </w:r>
-          </w:p>
-        </w:tc>
-        <w:tc>
-          <w:tcPr>
-            <w:tcW w:type="dxa" w:w="4032"/>
-          </w:tcPr>
-          <w:p>
-            <w:r/>
-            <w:r>
-              <w:rPr>
-                <w:b w:val="0"/>
-                <w:sz w:val="17"/>
-              </w:rPr>
-              <w:t>posting penyusutan</w:t>
+              <w:t>Garis Lurus atau Saldo Menurun; jumlah &amp; panjang periode</w:t>
             </w:r>
           </w:p>
         </w:tc>
@@ -4222,46 +5461,10 @@
     <w:p/>
     <w:p>
       <w:pPr>
-        <w:pStyle w:val="Heading2"/>
+        <w:pStyle w:val="ListBullet"/>
       </w:pPr>
       <w:r>
-        <w:rPr>
-          <w:color w:val="006A4E"/>
-          <w:sz w:val="25"/>
-        </w:rPr>
-        <w:t>5.4 CORETAX (lokalisasi pajak Indonesia)</w:t>
-      </w:r>
-    </w:p>
-    <w:p>
-      <w:pPr>
-        <w:pStyle w:val="ListNumber"/>
-      </w:pPr>
-      <w:r>
-        <w:t>Set CORETAX TIN/NPWP &amp; ID TKU pada kontak Company dan tiap kontak pelanggan (tab CORETAX).</w:t>
-      </w:r>
-    </w:p>
-    <w:p>
-      <w:pPr>
-        <w:pStyle w:val="ListNumber"/>
-      </w:pPr>
-      <w:r>
-        <w:t>Set CORETAX Type (A/B) + Unit Code pada produk (sewa = Service/B).</w:t>
-      </w:r>
-    </w:p>
-    <w:p>
-      <w:pPr>
-        <w:pStyle w:val="ListNumber"/>
-      </w:pPr>
-      <w:r>
-        <w:t>Isi register SPT (L9/L3B/L11A/L10A) bila perlu di Properties → CORETAX → SPT Registers.</w:t>
-      </w:r>
-    </w:p>
-    <w:p>
-      <w:pPr>
-        <w:pStyle w:val="ListNumber"/>
-      </w:pPr>
-      <w:r>
-        <w:t>Ekspor via CORETAX → e-Faktur / SPT Export; validasi XML terhadap XSD resmi DJP sebelum upload.</w:t>
+        <w:t>Compute Depreciation → Confirm → Post Due (atau cron). Revaluation: tambah baris +/- → Post Revaluations (board sisa dihitung ulang). Sync CORETAX L9 bila modul coretax aktif.</w:t>
       </w:r>
     </w:p>
     <w:p>
@@ -4273,7 +5476,718 @@
           <w:color w:val="006A4E"/>
           <w:sz w:val="25"/>
         </w:rPr>
-        <w:t>5.5 Portal &amp; Email</w:t>
+        <w:t>5.10 CORETAX (Lokalisasi Pajak Indonesia)</w:t>
+      </w:r>
+    </w:p>
+    <w:p>
+      <w:pPr>
+        <w:pStyle w:val="ListNumber"/>
+      </w:pPr>
+      <w:r>
+        <w:t>Company &amp; tiap pelanggan (Contacts → tab CORETAX): isi TIN/NPWP (16 digit), ID TKU, NIK bila perlu.</w:t>
+      </w:r>
+    </w:p>
+    <w:p>
+      <w:pPr>
+        <w:pStyle w:val="ListNumber"/>
+      </w:pPr>
+      <w:r>
+        <w:t>Produk: set CORETAX Type (A=barang / B=jasa) + Unit Code; sewa = Service/B.</w:t>
+      </w:r>
+    </w:p>
+    <w:p>
+      <w:pPr>
+        <w:pStyle w:val="ListNumber"/>
+      </w:pPr>
+      <w:r>
+        <w:t>Invoice pelanggan → tab CORETAX e-Faktur: cek Transaction Code (default 04), Additional Info, Facility Stamp bila ada fasilitas.</w:t>
+      </w:r>
+    </w:p>
+    <w:p>
+      <w:pPr>
+        <w:pStyle w:val="ListNumber"/>
+      </w:pPr>
+      <w:r>
+        <w:t>Vendor credit note (retur): isi Original Faktur No. &amp; tanggal untuk Retur PM.</w:t>
+      </w:r>
+    </w:p>
+    <w:p>
+      <w:pPr>
+        <w:pStyle w:val="ListNumber"/>
+      </w:pPr>
+      <w:r>
+        <w:t>Register SPT: Properties → CORETAX → SPT Registers untuk L9, L3B, L11A (Uncollectible/NonPerforming/Promosi/Entertainment), L10A — isi per Tax Year.</w:t>
+      </w:r>
+    </w:p>
+    <w:p>
+      <w:pPr>
+        <w:pStyle w:val="ListNumber"/>
+      </w:pPr>
+      <w:r>
+        <w:t>Ekspor: CORETAX → e-Faktur / SPT Export → pilih jenis + periode/Tax Year → Export XML.</w:t>
+      </w:r>
+    </w:p>
+    <w:p>
+      <w:pPr>
+        <w:pStyle w:val="ListNumber"/>
+      </w:pPr>
+      <w:r>
+        <w:t>WAJIB validasi XML hasil terhadap XSD resmi DJP sebelum diunggah ke portal CORETAX.</w:t>
+      </w:r>
+    </w:p>
+    <w:p>
+      <w:pPr>
+        <w:pStyle w:val="Heading2"/>
+      </w:pPr>
+      <w:r>
+        <w:rPr>
+          <w:color w:val="006A4E"/>
+          <w:sz w:val="25"/>
+        </w:rPr>
+        <w:t>5.11 Scheduled Actions (Cron) — aktifkan &amp; atur interval</w:t>
+      </w:r>
+    </w:p>
+    <w:p>
+      <w:pPr>
+        <w:spacing w:after="120"/>
+      </w:pPr>
+      <w:r>
+        <w:rPr>
+          <w:b w:val="0"/>
+          <w:i/>
+          <w:color w:val="555555"/>
+          <w:sz w:val="21"/>
+        </w:rPr>
+        <w:t>Settings → Technical → Scheduled Actions. Aktifkan dan sesuaikan interval (umumnya harian, di luar jam sibuk). Pastikan worker cron Odoo berjalan.</w:t>
+      </w:r>
+    </w:p>
+    <w:tbl>
+      <w:tblPr>
+        <w:tblStyle w:val="TableGrid"/>
+        <w:tblW w:type="auto" w:w="0"/>
+        <w:jc w:val="center"/>
+        <w:tblLook w:firstColumn="1" w:firstRow="1" w:lastColumn="0" w:lastRow="0" w:noHBand="0" w:noVBand="1" w:val="04A0"/>
+      </w:tblPr>
+      <w:tblGrid>
+        <w:gridCol w:w="2160"/>
+        <w:gridCol w:w="2160"/>
+        <w:gridCol w:w="2160"/>
+        <w:gridCol w:w="2160"/>
+      </w:tblGrid>
+      <w:tr>
+        <w:tc>
+          <w:tcPr>
+            <w:tcW w:type="dxa" w:w="2160"/>
+            <w:shd w:val="clear" w:color="auto" w:fill="1F3964"/>
+          </w:tcPr>
+          <w:p>
+            <w:r/>
+            <w:r>
+              <w:rPr>
+                <w:b/>
+                <w:color w:val="FFFFFF"/>
+                <w:sz w:val="18"/>
+              </w:rPr>
+              <w:t>Scheduled Action</w:t>
+            </w:r>
+          </w:p>
+        </w:tc>
+        <w:tc>
+          <w:tcPr>
+            <w:tcW w:type="dxa" w:w="2160"/>
+            <w:shd w:val="clear" w:color="auto" w:fill="1F3964"/>
+          </w:tcPr>
+          <w:p>
+            <w:r/>
+            <w:r>
+              <w:rPr>
+                <w:b/>
+                <w:color w:val="FFFFFF"/>
+                <w:sz w:val="18"/>
+              </w:rPr>
+              <w:t>Modul</w:t>
+            </w:r>
+          </w:p>
+        </w:tc>
+        <w:tc>
+          <w:tcPr>
+            <w:tcW w:type="dxa" w:w="2160"/>
+            <w:shd w:val="clear" w:color="auto" w:fill="1F3964"/>
+          </w:tcPr>
+          <w:p>
+            <w:r/>
+            <w:r>
+              <w:rPr>
+                <w:b/>
+                <w:color w:val="FFFFFF"/>
+                <w:sz w:val="18"/>
+              </w:rPr>
+              <w:t>Interval saran</w:t>
+            </w:r>
+          </w:p>
+        </w:tc>
+        <w:tc>
+          <w:tcPr>
+            <w:tcW w:type="dxa" w:w="2160"/>
+            <w:shd w:val="clear" w:color="auto" w:fill="1F3964"/>
+          </w:tcPr>
+          <w:p>
+            <w:r/>
+            <w:r>
+              <w:rPr>
+                <w:b/>
+                <w:color w:val="FFFFFF"/>
+                <w:sz w:val="18"/>
+              </w:rPr>
+              <w:t>Fungsi</w:t>
+            </w:r>
+          </w:p>
+        </w:tc>
+      </w:tr>
+      <w:tr>
+        <w:tc>
+          <w:tcPr>
+            <w:tcW w:type="dxa" w:w="3312"/>
+          </w:tcPr>
+          <w:p>
+            <w:r/>
+            <w:r>
+              <w:rPr>
+                <w:b w:val="0"/>
+                <w:sz w:val="16"/>
+              </w:rPr>
+              <w:t>Apply Due Rent Escalations</w:t>
+            </w:r>
+          </w:p>
+        </w:tc>
+        <w:tc>
+          <w:tcPr>
+            <w:tcW w:type="dxa" w:w="1728"/>
+          </w:tcPr>
+          <w:p>
+            <w:r/>
+            <w:r>
+              <w:rPr>
+                <w:b w:val="0"/>
+                <w:sz w:val="16"/>
+              </w:rPr>
+              <w:t>rent_escalation</w:t>
+            </w:r>
+          </w:p>
+        </w:tc>
+        <w:tc>
+          <w:tcPr>
+            <w:tcW w:type="dxa" w:w="1584"/>
+          </w:tcPr>
+          <w:p>
+            <w:r/>
+            <w:r>
+              <w:rPr>
+                <w:b w:val="0"/>
+                <w:sz w:val="16"/>
+              </w:rPr>
+              <w:t>Harian</w:t>
+            </w:r>
+          </w:p>
+        </w:tc>
+        <w:tc>
+          <w:tcPr>
+            <w:tcW w:type="dxa" w:w="3024"/>
+          </w:tcPr>
+          <w:p>
+            <w:r/>
+            <w:r>
+              <w:rPr>
+                <w:b w:val="0"/>
+                <w:sz w:val="16"/>
+              </w:rPr>
+              <w:t>naikkan sewa pada tanggal jatuh tempo</w:t>
+            </w:r>
+          </w:p>
+        </w:tc>
+      </w:tr>
+      <w:tr>
+        <w:tc>
+          <w:tcPr>
+            <w:tcW w:type="dxa" w:w="3312"/>
+          </w:tcPr>
+          <w:p>
+            <w:r/>
+            <w:r>
+              <w:rPr>
+                <w:b w:val="0"/>
+                <w:sz w:val="16"/>
+              </w:rPr>
+              <w:t>Run Dunning</w:t>
+            </w:r>
+          </w:p>
+        </w:tc>
+        <w:tc>
+          <w:tcPr>
+            <w:tcW w:type="dxa" w:w="1728"/>
+          </w:tcPr>
+          <w:p>
+            <w:r/>
+            <w:r>
+              <w:rPr>
+                <w:b w:val="0"/>
+                <w:sz w:val="16"/>
+              </w:rPr>
+              <w:t>dunning</w:t>
+            </w:r>
+          </w:p>
+        </w:tc>
+        <w:tc>
+          <w:tcPr>
+            <w:tcW w:type="dxa" w:w="1584"/>
+          </w:tcPr>
+          <w:p>
+            <w:r/>
+            <w:r>
+              <w:rPr>
+                <w:b w:val="0"/>
+                <w:sz w:val="16"/>
+              </w:rPr>
+              <w:t>Harian</w:t>
+            </w:r>
+          </w:p>
+        </w:tc>
+        <w:tc>
+          <w:tcPr>
+            <w:tcW w:type="dxa" w:w="3024"/>
+          </w:tcPr>
+          <w:p>
+            <w:r/>
+            <w:r>
+              <w:rPr>
+                <w:b w:val="0"/>
+                <w:sz w:val="16"/>
+              </w:rPr>
+              <w:t>kirim reminder + late fee bertingkat</w:t>
+            </w:r>
+          </w:p>
+        </w:tc>
+      </w:tr>
+      <w:tr>
+        <w:tc>
+          <w:tcPr>
+            <w:tcW w:type="dxa" w:w="3312"/>
+          </w:tcPr>
+          <w:p>
+            <w:r/>
+            <w:r>
+              <w:rPr>
+                <w:b w:val="0"/>
+                <w:sz w:val="16"/>
+              </w:rPr>
+              <w:t>Generate Preventive Maintenance</w:t>
+            </w:r>
+          </w:p>
+        </w:tc>
+        <w:tc>
+          <w:tcPr>
+            <w:tcW w:type="dxa" w:w="1728"/>
+          </w:tcPr>
+          <w:p>
+            <w:r/>
+            <w:r>
+              <w:rPr>
+                <w:b w:val="0"/>
+                <w:sz w:val="16"/>
+              </w:rPr>
+              <w:t>ppm</w:t>
+            </w:r>
+          </w:p>
+        </w:tc>
+        <w:tc>
+          <w:tcPr>
+            <w:tcW w:type="dxa" w:w="1584"/>
+          </w:tcPr>
+          <w:p>
+            <w:r/>
+            <w:r>
+              <w:rPr>
+                <w:b w:val="0"/>
+                <w:sz w:val="16"/>
+              </w:rPr>
+              <w:t>Harian</w:t>
+            </w:r>
+          </w:p>
+        </w:tc>
+        <w:tc>
+          <w:tcPr>
+            <w:tcW w:type="dxa" w:w="3024"/>
+          </w:tcPr>
+          <w:p>
+            <w:r/>
+            <w:r>
+              <w:rPr>
+                <w:b w:val="0"/>
+                <w:sz w:val="16"/>
+              </w:rPr>
+              <w:t>buat maintenance request terjadwal</w:t>
+            </w:r>
+          </w:p>
+        </w:tc>
+      </w:tr>
+      <w:tr>
+        <w:tc>
+          <w:tcPr>
+            <w:tcW w:type="dxa" w:w="3312"/>
+          </w:tcPr>
+          <w:p>
+            <w:r/>
+            <w:r>
+              <w:rPr>
+                <w:b w:val="0"/>
+                <w:sz w:val="16"/>
+              </w:rPr>
+              <w:t>Guarantee Check Expiry</w:t>
+            </w:r>
+          </w:p>
+        </w:tc>
+        <w:tc>
+          <w:tcPr>
+            <w:tcW w:type="dxa" w:w="1728"/>
+          </w:tcPr>
+          <w:p>
+            <w:r/>
+            <w:r>
+              <w:rPr>
+                <w:b w:val="0"/>
+                <w:sz w:val="16"/>
+              </w:rPr>
+              <w:t>guarantee</w:t>
+            </w:r>
+          </w:p>
+        </w:tc>
+        <w:tc>
+          <w:tcPr>
+            <w:tcW w:type="dxa" w:w="1584"/>
+          </w:tcPr>
+          <w:p>
+            <w:r/>
+            <w:r>
+              <w:rPr>
+                <w:b w:val="0"/>
+                <w:sz w:val="16"/>
+              </w:rPr>
+              <w:t>Harian</w:t>
+            </w:r>
+          </w:p>
+        </w:tc>
+        <w:tc>
+          <w:tcPr>
+            <w:tcW w:type="dxa" w:w="3024"/>
+          </w:tcPr>
+          <w:p>
+            <w:r/>
+            <w:r>
+              <w:rPr>
+                <w:b w:val="0"/>
+                <w:sz w:val="16"/>
+              </w:rPr>
+              <w:t>auto-expire + reminder activity</w:t>
+            </w:r>
+          </w:p>
+        </w:tc>
+      </w:tr>
+      <w:tr>
+        <w:tc>
+          <w:tcPr>
+            <w:tcW w:type="dxa" w:w="3312"/>
+          </w:tcPr>
+          <w:p>
+            <w:r/>
+            <w:r>
+              <w:rPr>
+                <w:b w:val="0"/>
+                <w:sz w:val="16"/>
+              </w:rPr>
+              <w:t>Insurance Check Expiry</w:t>
+            </w:r>
+          </w:p>
+        </w:tc>
+        <w:tc>
+          <w:tcPr>
+            <w:tcW w:type="dxa" w:w="1728"/>
+          </w:tcPr>
+          <w:p>
+            <w:r/>
+            <w:r>
+              <w:rPr>
+                <w:b w:val="0"/>
+                <w:sz w:val="16"/>
+              </w:rPr>
+              <w:t>insurance</w:t>
+            </w:r>
+          </w:p>
+        </w:tc>
+        <w:tc>
+          <w:tcPr>
+            <w:tcW w:type="dxa" w:w="1584"/>
+          </w:tcPr>
+          <w:p>
+            <w:r/>
+            <w:r>
+              <w:rPr>
+                <w:b w:val="0"/>
+                <w:sz w:val="16"/>
+              </w:rPr>
+              <w:t>Harian</w:t>
+            </w:r>
+          </w:p>
+        </w:tc>
+        <w:tc>
+          <w:tcPr>
+            <w:tcW w:type="dxa" w:w="3024"/>
+          </w:tcPr>
+          <w:p>
+            <w:r/>
+            <w:r>
+              <w:rPr>
+                <w:b w:val="0"/>
+                <w:sz w:val="16"/>
+              </w:rPr>
+              <w:t>auto-expire + reminder activity</w:t>
+            </w:r>
+          </w:p>
+        </w:tc>
+      </w:tr>
+      <w:tr>
+        <w:tc>
+          <w:tcPr>
+            <w:tcW w:type="dxa" w:w="3312"/>
+          </w:tcPr>
+          <w:p>
+            <w:r/>
+            <w:r>
+              <w:rPr>
+                <w:b w:val="0"/>
+                <w:sz w:val="16"/>
+              </w:rPr>
+              <w:t>Lease Expiry / Renewal Reminder</w:t>
+            </w:r>
+          </w:p>
+        </w:tc>
+        <w:tc>
+          <w:tcPr>
+            <w:tcW w:type="dxa" w:w="1728"/>
+          </w:tcPr>
+          <w:p>
+            <w:r/>
+            <w:r>
+              <w:rPr>
+                <w:b w:val="0"/>
+                <w:sz w:val="16"/>
+              </w:rPr>
+              <w:t>lease_expiry</w:t>
+            </w:r>
+          </w:p>
+        </w:tc>
+        <w:tc>
+          <w:tcPr>
+            <w:tcW w:type="dxa" w:w="1584"/>
+          </w:tcPr>
+          <w:p>
+            <w:r/>
+            <w:r>
+              <w:rPr>
+                <w:b w:val="0"/>
+                <w:sz w:val="16"/>
+              </w:rPr>
+              <w:t>Harian</w:t>
+            </w:r>
+          </w:p>
+        </w:tc>
+        <w:tc>
+          <w:tcPr>
+            <w:tcW w:type="dxa" w:w="3024"/>
+          </w:tcPr>
+          <w:p>
+            <w:r/>
+            <w:r>
+              <w:rPr>
+                <w:b w:val="0"/>
+                <w:sz w:val="16"/>
+              </w:rPr>
+              <w:t>aktivitas perpanjangan 30/90 hari</w:t>
+            </w:r>
+          </w:p>
+        </w:tc>
+      </w:tr>
+      <w:tr>
+        <w:tc>
+          <w:tcPr>
+            <w:tcW w:type="dxa" w:w="3312"/>
+          </w:tcPr>
+          <w:p>
+            <w:r/>
+            <w:r>
+              <w:rPr>
+                <w:b w:val="0"/>
+                <w:sz w:val="16"/>
+              </w:rPr>
+              <w:t>Post Due Depreciation</w:t>
+            </w:r>
+          </w:p>
+        </w:tc>
+        <w:tc>
+          <w:tcPr>
+            <w:tcW w:type="dxa" w:w="1728"/>
+          </w:tcPr>
+          <w:p>
+            <w:r/>
+            <w:r>
+              <w:rPr>
+                <w:b w:val="0"/>
+                <w:sz w:val="16"/>
+              </w:rPr>
+              <w:t>asset</w:t>
+            </w:r>
+          </w:p>
+        </w:tc>
+        <w:tc>
+          <w:tcPr>
+            <w:tcW w:type="dxa" w:w="1584"/>
+          </w:tcPr>
+          <w:p>
+            <w:r/>
+            <w:r>
+              <w:rPr>
+                <w:b w:val="0"/>
+                <w:sz w:val="16"/>
+              </w:rPr>
+              <w:t>Harian/Bulanan</w:t>
+            </w:r>
+          </w:p>
+        </w:tc>
+        <w:tc>
+          <w:tcPr>
+            <w:tcW w:type="dxa" w:w="3024"/>
+          </w:tcPr>
+          <w:p>
+            <w:r/>
+            <w:r>
+              <w:rPr>
+                <w:b w:val="0"/>
+                <w:sz w:val="16"/>
+              </w:rPr>
+              <w:t>posting baris penyusutan jatuh tempo</w:t>
+            </w:r>
+          </w:p>
+        </w:tc>
+      </w:tr>
+    </w:tbl>
+    <w:p/>
+    <w:p>
+      <w:pPr>
+        <w:pStyle w:val="ListBullet"/>
+      </w:pPr>
+      <w:r>
+        <w:rPr>
+          <w:b/>
+        </w:rPr>
+        <w:t xml:space="preserve">Dunning: </w:t>
+      </w:r>
+      <w:r>
+        <w:t>Dunning: definisikan level di Properties → Dunning Levels (hari overdue, template email, late fee on/off) sebelum mengaktifkan cron.</w:t>
+      </w:r>
+    </w:p>
+    <w:p>
+      <w:pPr>
+        <w:pStyle w:val="ListBullet"/>
+      </w:pPr>
+      <w:r>
+        <w:rPr>
+          <w:b/>
+        </w:rPr>
+        <w:t xml:space="preserve">Escalation: </w:t>
+      </w:r>
+      <w:r>
+        <w:t>Escalation: set tipe (% / amount), nilai, frekuensi, dan Next Escalation Date di kontrak.</w:t>
+      </w:r>
+    </w:p>
+    <w:p>
+      <w:pPr>
+        <w:pStyle w:val="ListBullet"/>
+      </w:pPr>
+      <w:r>
+        <w:rPr>
+          <w:b/>
+        </w:rPr>
+        <w:t xml:space="preserve">PPM: </w:t>
+      </w:r>
+      <w:r>
+        <w:t>PPM: set frekuensi, Next Date, dan SLA pada plan; cron membuat request &amp; menggeser Next Date.</w:t>
+      </w:r>
+    </w:p>
+    <w:p>
+      <w:pPr>
+        <w:pStyle w:val="Heading2"/>
+      </w:pPr>
+      <w:r>
+        <w:rPr>
+          <w:color w:val="006A4E"/>
+          <w:sz w:val="25"/>
+        </w:rPr>
+        <w:t>5.12 Penomoran, Portal, Email &amp; Multi-Entitas</w:t>
+      </w:r>
+    </w:p>
+    <w:p>
+      <w:pPr>
+        <w:pStyle w:val="ListBullet"/>
+      </w:pPr>
+      <w:r>
+        <w:rPr>
+          <w:b/>
+        </w:rPr>
+        <w:t xml:space="preserve">Sequence: </w:t>
+      </w:r>
+      <w:r>
+        <w:t>Penomoran (ir.sequence) terbuat otomatis (Owner Remittance, Security Deposit, dll). Sesuaikan prefix/format di Settings → Technical → Sequences bila perlu.</w:t>
+      </w:r>
+    </w:p>
+    <w:p>
+      <w:pPr>
+        <w:pStyle w:val="ListBullet"/>
+      </w:pPr>
+      <w:r>
+        <w:rPr>
+          <w:b/>
+        </w:rPr>
+        <w:t xml:space="preserve">Portal: </w:t>
+      </w:r>
+      <w:r>
+        <w:t>Tenant: Contacts → kontak → Action → Grant portal access. Owner: idem untuk pemilik (muncul di /my/properties).</w:t>
+      </w:r>
+    </w:p>
+    <w:p>
+      <w:pPr>
+        <w:pStyle w:val="ListBullet"/>
+      </w:pPr>
+      <w:r>
+        <w:rPr>
+          <w:b/>
+        </w:rPr>
+        <w:t xml:space="preserve">Email: </w:t>
+      </w:r>
+      <w:r>
+        <w:t>Settings → Technical → Outgoing Mail Servers (SMTP) wajib aktif untuk email dunning/reminder; uji kirim test.</w:t>
+      </w:r>
+    </w:p>
+    <w:p>
+      <w:pPr>
+        <w:pStyle w:val="ListBullet"/>
+      </w:pPr>
+      <w:r>
+        <w:rPr>
+          <w:b/>
+        </w:rPr>
+        <w:t xml:space="preserve">Multi: </w:t>
+      </w:r>
+      <w:r>
+        <w:t>Aktifkan Multi-Company &amp; Multi-Currency di Settings bila portofolio lintas entitas/mata uang; set kurs di Accounting → Currencies.</w:t>
       </w:r>
     </w:p>
     <w:p>
@@ -4287,35 +6201,7 @@
         <w:t xml:space="preserve">Akses: </w:t>
       </w:r>
       <w:r>
-        <w:t>Tenant: Contacts → kontak tenant → Action → Grant portal access. Owner: idem untuk pemilik.</w:t>
-      </w:r>
-    </w:p>
-    <w:p>
-      <w:pPr>
-        <w:pStyle w:val="ListBullet"/>
-      </w:pPr>
-      <w:r>
-        <w:rPr>
-          <w:b/>
-        </w:rPr>
-        <w:t xml:space="preserve">Email: </w:t>
-      </w:r>
-      <w:r>
-        <w:t>Settings → Technical → Outgoing Mail Servers untuk pengiriman email dunning/reminder.</w:t>
-      </w:r>
-    </w:p>
-    <w:p>
-      <w:pPr>
-        <w:pStyle w:val="ListBullet"/>
-      </w:pPr>
-      <w:r>
-        <w:rPr>
-          <w:b/>
-        </w:rPr>
-        <w:t xml:space="preserve">Lainnya: </w:t>
-      </w:r>
-      <w:r>
-        <w:t>Multi-company &amp; multi-currency diaktifkan di Settings bila portofolio lintas entitas/mata uang.</w:t>
+        <w:t>Atur Hak Akses (Settings → Users): Accounting Manager untuk approval Budget &amp; ekspor CORETAX; Portal untuk tenant/owner.</w:t>
       </w:r>
     </w:p>
     <w:p>
@@ -4425,6 +6311,218 @@
       </w:pPr>
       <w:r>
         <w:t>Akhir sewa: Lease Expiry reminder → perpanjang atau Handover Move-out + make-good + selesaikan Security Deposit.</w:t>
+      </w:r>
+    </w:p>
+    <w:p>
+      <w:pPr>
+        <w:jc w:val="center"/>
+      </w:pPr>
+      <w:r>
+        <w:drawing>
+          <wp:inline xmlns:a="http://schemas.openxmlformats.org/drawingml/2006/main" xmlns:pic="http://schemas.openxmlformats.org/drawingml/2006/picture">
+            <wp:extent cx="6035040" cy="3502479"/>
+            <wp:docPr id="5" name="Picture 5"/>
+            <wp:cNvGraphicFramePr>
+              <a:graphicFrameLocks noChangeAspect="1"/>
+            </wp:cNvGraphicFramePr>
+            <a:graphic>
+              <a:graphicData uri="http://schemas.openxmlformats.org/drawingml/2006/picture">
+                <pic:pic>
+                  <pic:nvPicPr>
+                    <pic:cNvPr id="0" name="04-billing-penagihan.png"/>
+                    <pic:cNvPicPr/>
+                  </pic:nvPicPr>
+                  <pic:blipFill>
+                    <a:blip r:embed="rId13"/>
+                    <a:stretch>
+                      <a:fillRect/>
+                    </a:stretch>
+                  </pic:blipFill>
+                  <pic:spPr>
+                    <a:xfrm>
+                      <a:off x="0" y="0"/>
+                      <a:ext cx="6035040" cy="3502479"/>
+                    </a:xfrm>
+                    <a:prstGeom prst="rect"/>
+                  </pic:spPr>
+                </pic:pic>
+              </a:graphicData>
+            </a:graphic>
+          </wp:inline>
+        </w:drawing>
+      </w:r>
+    </w:p>
+    <w:p>
+      <w:pPr>
+        <w:spacing w:after="200"/>
+        <w:jc w:val="center"/>
+      </w:pPr>
+      <w:r>
+        <w:rPr>
+          <w:i/>
+          <w:color w:val="555555"/>
+          <w:sz w:val="17"/>
+        </w:rPr>
+        <w:t>Gambar 5. Alur billing bulanan &amp; penagihan (generasi tagihan → posting → dunning → trust).</w:t>
+      </w:r>
+    </w:p>
+    <w:p>
+      <w:pPr>
+        <w:jc w:val="center"/>
+      </w:pPr>
+      <w:r>
+        <w:drawing>
+          <wp:inline xmlns:a="http://schemas.openxmlformats.org/drawingml/2006/main" xmlns:pic="http://schemas.openxmlformats.org/drawingml/2006/picture">
+            <wp:extent cx="6035040" cy="723589"/>
+            <wp:docPr id="6" name="Picture 6"/>
+            <wp:cNvGraphicFramePr>
+              <a:graphicFrameLocks noChangeAspect="1"/>
+            </wp:cNvGraphicFramePr>
+            <a:graphic>
+              <a:graphicData uri="http://schemas.openxmlformats.org/drawingml/2006/picture">
+                <pic:pic>
+                  <pic:nvPicPr>
+                    <pic:cNvPr id="0" name="05-pengeluaran.png"/>
+                    <pic:cNvPicPr/>
+                  </pic:nvPicPr>
+                  <pic:blipFill>
+                    <a:blip r:embed="rId14"/>
+                    <a:stretch>
+                      <a:fillRect/>
+                    </a:stretch>
+                  </pic:blipFill>
+                  <pic:spPr>
+                    <a:xfrm>
+                      <a:off x="0" y="0"/>
+                      <a:ext cx="6035040" cy="723589"/>
+                    </a:xfrm>
+                    <a:prstGeom prst="rect"/>
+                  </pic:spPr>
+                </pic:pic>
+              </a:graphicData>
+            </a:graphic>
+          </wp:inline>
+        </w:drawing>
+      </w:r>
+    </w:p>
+    <w:p>
+      <w:pPr>
+        <w:spacing w:after="200"/>
+        <w:jc w:val="center"/>
+      </w:pPr>
+      <w:r>
+        <w:rPr>
+          <w:i/>
+          <w:color w:val="555555"/>
+          <w:sz w:val="17"/>
+        </w:rPr>
+        <w:t>Gambar 6. Alur pengeluaran: procurement &amp; maintenance → vendor bill ber-atribusi properti.</w:t>
+      </w:r>
+    </w:p>
+    <w:p>
+      <w:pPr>
+        <w:jc w:val="center"/>
+      </w:pPr>
+      <w:r>
+        <w:drawing>
+          <wp:inline xmlns:a="http://schemas.openxmlformats.org/drawingml/2006/main" xmlns:pic="http://schemas.openxmlformats.org/drawingml/2006/picture">
+            <wp:extent cx="6035040" cy="3471688"/>
+            <wp:docPr id="7" name="Picture 7"/>
+            <wp:cNvGraphicFramePr>
+              <a:graphicFrameLocks noChangeAspect="1"/>
+            </wp:cNvGraphicFramePr>
+            <a:graphic>
+              <a:graphicData uri="http://schemas.openxmlformats.org/drawingml/2006/picture">
+                <pic:pic>
+                  <pic:nvPicPr>
+                    <pic:cNvPr id="0" name="06-tutup-periode.png"/>
+                    <pic:cNvPicPr/>
+                  </pic:nvPicPr>
+                  <pic:blipFill>
+                    <a:blip r:embed="rId15"/>
+                    <a:stretch>
+                      <a:fillRect/>
+                    </a:stretch>
+                  </pic:blipFill>
+                  <pic:spPr>
+                    <a:xfrm>
+                      <a:off x="0" y="0"/>
+                      <a:ext cx="6035040" cy="3471688"/>
+                    </a:xfrm>
+                    <a:prstGeom prst="rect"/>
+                  </pic:spPr>
+                </pic:pic>
+              </a:graphicData>
+            </a:graphic>
+          </wp:inline>
+        </w:drawing>
+      </w:r>
+    </w:p>
+    <w:p>
+      <w:pPr>
+        <w:spacing w:after="200"/>
+        <w:jc w:val="center"/>
+      </w:pPr>
+      <w:r>
+        <w:rPr>
+          <w:i/>
+          <w:color w:val="555555"/>
+          <w:sz w:val="17"/>
+        </w:rPr>
+        <w:t>Gambar 7. Alur tutup periode: Owners Statement, rekonsiliasi trust &amp; owner remittance.</w:t>
+      </w:r>
+    </w:p>
+    <w:p>
+      <w:pPr>
+        <w:jc w:val="center"/>
+      </w:pPr>
+      <w:r>
+        <w:drawing>
+          <wp:inline xmlns:a="http://schemas.openxmlformats.org/drawingml/2006/main" xmlns:pic="http://schemas.openxmlformats.org/drawingml/2006/picture">
+            <wp:extent cx="6035040" cy="6239435"/>
+            <wp:docPr id="8" name="Picture 8"/>
+            <wp:cNvGraphicFramePr>
+              <a:graphicFrameLocks noChangeAspect="1"/>
+            </wp:cNvGraphicFramePr>
+            <a:graphic>
+              <a:graphicData uri="http://schemas.openxmlformats.org/drawingml/2006/picture">
+                <pic:pic>
+                  <pic:nvPicPr>
+                    <pic:cNvPr id="0" name="07-fixed-asset.png"/>
+                    <pic:cNvPicPr/>
+                  </pic:nvPicPr>
+                  <pic:blipFill>
+                    <a:blip r:embed="rId16"/>
+                    <a:stretch>
+                      <a:fillRect/>
+                    </a:stretch>
+                  </pic:blipFill>
+                  <pic:spPr>
+                    <a:xfrm>
+                      <a:off x="0" y="0"/>
+                      <a:ext cx="6035040" cy="6239435"/>
+                    </a:xfrm>
+                    <a:prstGeom prst="rect"/>
+                  </pic:spPr>
+                </pic:pic>
+              </a:graphicData>
+            </a:graphic>
+          </wp:inline>
+        </w:drawing>
+      </w:r>
+    </w:p>
+    <w:p>
+      <w:pPr>
+        <w:spacing w:after="200"/>
+        <w:jc w:val="center"/>
+      </w:pPr>
+      <w:r>
+        <w:rPr>
+          <w:i/>
+          <w:color w:val="555555"/>
+          <w:sz w:val="17"/>
+        </w:rPr>
+        <w:t>Gambar 8. Alur fixed asset: depresiasi terjadwal &amp; revaluation terhadap reserve.</w:t>
       </w:r>
     </w:p>
     <w:p>

</xml_diff>